<commit_message>
Prepare thesis submission files
</commit_message>
<xml_diff>
--- a/report/MSE_Thesis_Decomposition_of_CI_Trees_MM.docx
+++ b/report/MSE_Thesis_Decomposition_of_CI_Trees_MM.docx
@@ -24,7 +24,7 @@
         <w:pStyle w:val="BodyText"/>
       </w:pPr>
       <w:r>
-        <w:t xml:space="preserve">The analysis compared indirect decomposition methods with direct concentration-index trees and forests. In the indirect methods, a model was fitted first, either a generalised linear model or a predictive model such as a random forest, and the fitted model was then used to decompose inequality. The regression decomposition placed the greatest weight on the mother’s education and the father’s agricultural occupation. The SHAP decomposition was less concentrated on these two variables. Residence, household wealth, mother’s education, skilled birth attendance, and parental occupation all appeared across the criteria.</w:t>
+        <w:t xml:space="preserve">The analysis compared indirect decomposition methods with direct concentration-index trees and forests. In the indirect methods, a model was fitted first, either a generalised linear model or a predictive model such as a random forest, and the fitted model was then used to decompose inequality. The regression decomposition placed the greatest weight on the mother’s education and the father’s agricultural occupation. The SHAP decomposition was interpreted as an explanation of the fitted predictive model and gave a less concentrated pattern. Residence, household wealth, mother’s education, skilled birth attendance, parental occupation, and regional indicators all appeared across the criteria.</w:t>
       </w:r>
     </w:p>
     <w:p>
@@ -32,7 +32,7 @@
         <w:pStyle w:val="BodyText"/>
       </w:pPr>
       <w:r>
-        <w:t xml:space="preserve">The direct trees added the subgroup part of the analysis. The rank-dependent trees based on standard concentration index(</w:t>
+        <w:t xml:space="preserve">The direct trees added the subgroup part of the analysis. The rank-dependent trees based on the standard concentration index (</w:t>
       </w:r>
       <m:oMath>
         <m:r>
@@ -43,7 +43,7 @@
         </m:r>
       </m:oMath>
       <w:r>
-        <w:t xml:space="preserve">), generalised concentration index(</w:t>
+        <w:t xml:space="preserve">), generalised concentration index (</w:t>
       </w:r>
       <m:oMath>
         <m:r>
@@ -57,7 +57,7 @@
         </m:r>
       </m:oMath>
       <w:r>
-        <w:t xml:space="preserve">), and corrected concentration index(</w:t>
+        <w:t xml:space="preserve">), and corrected concentration index (</w:t>
       </w:r>
       <m:oMath>
         <m:r>
@@ -71,7 +71,7 @@
         </m:r>
       </m:oMath>
       <w:r>
-        <w:t xml:space="preserve">) split mainly through mother’s education, father’s agricultural occupation, skilled birth attendance, household wealth, and Katanga. The high-mortality branch was made up of children whose mothers had no education, who lived in low-wealth households, and who resided in Katanga. This pattern was clear in the fitted data, but it did not carry well to the validation folds. The level-dependent concentration index(</w:t>
+        <w:t xml:space="preserve">) split mainly through mother’s education, father’s agricultural occupation, skilled birth attendance, household wealth, and Katanga. The high-mortality branch was made up of children whose mothers had no education, who lived in low-wealth households, and who resided in Katanga. This pattern was clear in the fitted data, but it did not carry well to the primary sampling unit (PSU)-held-out validation folds. The level-dependent concentration index (</w:t>
       </w:r>
       <m:oMath>
         <m:r>
@@ -79,7 +79,7 @@
         </m:r>
       </m:oMath>
       <w:r>
-        <w:t xml:space="preserve">) method gave a different tree. It was first split by residence, then by occupation, wealth, and province. The</w:t>
+        <w:t xml:space="preserve">) method gave a different tree, beginning with residence and then splitting by occupation, wealth, and province. The</w:t>
       </w:r>
       <w:r>
         <w:t xml:space="preserve"> </w:t>
@@ -93,7 +93,7 @@
         <w:t xml:space="preserve"> </w:t>
       </w:r>
       <w:r>
-        <w:t xml:space="preserve">tree and forest both kept positive validation gains, so the level-dependent result was treated as the more stable direct result in this application.</w:t>
+        <w:t xml:space="preserve">tree and forest retained positive validation gains. However, because the DHS wealth index is not ratio-scale, this result was treated as a sensitivity analysis rather than as the final direct result.</w:t>
       </w:r>
     </w:p>
     <w:p>
@@ -101,7 +101,7 @@
         <w:pStyle w:val="BodyText"/>
       </w:pPr>
       <w:r>
-        <w:t xml:space="preserve">The thesis shows that concentration-index trees can be used to add subgroup rules to the decomposition of health inequality. The fitted tree can be read as a decision rule, making the result easier to discuss than a table of percentage contributions alone.</w:t>
+        <w:t xml:space="preserve">The tree adds subgroup rules to the decomposition. It shows the paths to groups where under-five deaths were more or less concentrated. These are weighted descriptive results. They were checked with PSU-held-out validation and PSU bootstrap checks, but they are not formal survey-design estimates.</w:t>
       </w:r>
     </w:p>
     <w:bookmarkEnd w:id="9"/>
@@ -159,7 +159,7 @@
         <w:t xml:space="preserve">)</w:t>
       </w:r>
       <w:r>
-        <w:t xml:space="preserve">. Reduction in under-5 mortality are linked to improved child health services, greater access to care, and lower levels of extreme poverty</w:t>
+        <w:t xml:space="preserve">. Reductions in under-five mortality are linked to improved child health services, greater access to care, and lower levels of extreme poverty</w:t>
       </w:r>
       <w:r>
         <w:t xml:space="preserve"> </w:t>
@@ -270,7 +270,7 @@
         <w:pStyle w:val="BodyText"/>
       </w:pPr>
       <w:r>
-        <w:t xml:space="preserve">When statistical methods such as regression analysis are used in policy making, a national estimate may show that poorer children have higher mortality rates. However, it can hide subgroup differences linked to household conditions, province(administrative areas), maternal background, or demographic characteristics. Identifying risk groups matters because interventions are organised in real settings, through health facilities, communities, provinces(administrative areas), and programme catchment areas. A more detailed inequality analysis can therefore identify the groups that should receive attention and indicate where a single public health response may not be sufficient.</w:t>
+        <w:t xml:space="preserve">When statistical methods such as regression analysis are used in policy making, a national estimate may show that poorer children have higher mortality rates. However, it can hide subgroup differences linked to household conditions, province (administrative area), maternal background, or demographic characteristics. Identifying risk groups matters because interventions are organised in real settings, through health facilities, communities, provinces (administrative areas), and programme catchment areas. A more detailed inequality analysis can therefore identify the groups that should receive attention and indicate where a single public health response may not be sufficient.</w:t>
       </w:r>
     </w:p>
     <w:p>
@@ -380,7 +380,7 @@
         <w:pStyle w:val="BodyText"/>
       </w:pPr>
       <w:r>
-        <w:t xml:space="preserve">At each node, the tree searches across candidate variables and admissible split points, then selects the variable and split pair that gives the largest reduction in weighted within-node concentration-index impurity. The fitted tree is stored using the partykit tree representation for plotting and traversal</w:t>
+        <w:t xml:space="preserve">At each node, the tree searches over candidate variables and admissible split points, then selects the variable and split pair that yields the largest reduction in the weighted within-node concentration-index impurity. The fitted tree is stored using the partykit tree representation for plotting and traversal</w:t>
       </w:r>
       <w:r>
         <w:t xml:space="preserve"> </w:t>
@@ -710,6 +710,9 @@
         <w:t xml:space="preserve">Socioeconomic position is measured using the DHS household wealth index</w:t>
       </w:r>
       <w:r>
+        <w:t xml:space="preserve"> </w:t>
+      </w:r>
+      <w:r>
         <w:t xml:space="preserve">(</w:t>
       </w:r>
       <w:hyperlink w:anchor="ref-dhsprogram_wealth_index_construction">
@@ -4101,7 +4104,7 @@
         <w:t xml:space="preserve"> </w:t>
       </w:r>
       <w:r>
-        <w:t xml:space="preserve">index</w:t>
+        <w:t xml:space="preserve">index, the level-dependent construction is acceptable only when the socioeconomic variable has ratio-scale properties</w:t>
       </w:r>
       <w:r>
         <w:t xml:space="preserve"> </w:t>
@@ -4121,7 +4124,7 @@
         <w:t xml:space="preserve">)</w:t>
       </w:r>
       <w:r>
-        <w:t xml:space="preserve">, state that the level-dependent construction is acceptable only when the socioeconomic variable has ratio-scale properties; since the wealth index is a PCA score rather than income or consumption, results based on</w:t>
+        <w:t xml:space="preserve">; since the wealth index is a PCA score rather than income or consumption, results based on</w:t>
       </w:r>
       <w:r>
         <w:t xml:space="preserve"> </w:t>
@@ -4135,7 +4138,7 @@
         <w:t xml:space="preserve"> </w:t>
       </w:r>
       <w:r>
-        <w:t xml:space="preserve">should therefore be interpreted with caution. When the concentration indeces are used as impurity measures, the tree may not form the same subgroups under all concentration indices. A split chosen under</w:t>
+        <w:t xml:space="preserve">should therefore be interpreted with caution. When the concentration indices are used as impurity measures, the tree may not form the same subgroups under all concentration indices. A split chosen under</w:t>
       </w:r>
       <w:r>
         <w:t xml:space="preserve"> </w:t>
@@ -5015,7 +5018,10 @@
         <w:pStyle w:val="FirstParagraph"/>
       </w:pPr>
       <w:r>
-        <w:t xml:space="preserve">In a usual CART(Classification and Regression Trees)</w:t>
+        <w:t xml:space="preserve">In usual CART (Classification and Regression Trees)</w:t>
+      </w:r>
+      <w:r>
+        <w:t xml:space="preserve"> </w:t>
       </w:r>
       <w:r>
         <w:t xml:space="preserve">(</w:t>
@@ -8318,7 +8324,128 @@
         <w:pStyle w:val="FirstParagraph"/>
       </w:pPr>
       <w:r>
-        <w:t xml:space="preserve">Thus, the impurity measure affects the gain function, which in turn ranks candidate splits. The concentration indices here are impurity measures that are intended to be reduced. Under the standard concentration index rule, the child-node impurity is relative to the child-node mean:</w:t>
+        <w:t xml:space="preserve">Thus, the impurity measure affects the gain function, which in turn ranks candidate splits. Let</w:t>
+      </w:r>
+      <w:r>
+        <w:t xml:space="preserve"> </w:t>
+      </w:r>
+      <m:oMath>
+        <m:sSub>
+          <m:e>
+            <m:r>
+              <m:t>A</m:t>
+            </m:r>
+          </m:e>
+          <m:sub>
+            <m:r>
+              <m:t>t</m:t>
+            </m:r>
+          </m:sub>
+        </m:sSub>
+        <m:r>
+          <m:rPr>
+            <m:sty m:val="p"/>
+          </m:rPr>
+          <m:t>=</m:t>
+        </m:r>
+        <m:r>
+          <m:rPr>
+            <m:sty m:val="p"/>
+          </m:rPr>
+          <m:t>|</m:t>
+        </m:r>
+        <m:r>
+          <m:t>2</m:t>
+        </m:r>
+        <m:sSub>
+          <m:e>
+            <m:r>
+              <m:rPr>
+                <m:sty m:val="p"/>
+              </m:rPr>
+              <m:t>cov</m:t>
+            </m:r>
+          </m:e>
+          <m:sub>
+            <m:r>
+              <m:t>w</m:t>
+            </m:r>
+          </m:sub>
+        </m:sSub>
+        <m:r>
+          <m:rPr>
+            <m:sty m:val="p"/>
+          </m:rPr>
+          <m:t>(</m:t>
+        </m:r>
+        <m:sSub>
+          <m:e>
+            <m:r>
+              <m:t>Y</m:t>
+            </m:r>
+          </m:e>
+          <m:sub>
+            <m:r>
+              <m:t>i</m:t>
+            </m:r>
+          </m:sub>
+        </m:sSub>
+        <m:r>
+          <m:rPr>
+            <m:sty m:val="p"/>
+          </m:rPr>
+          <m:t>,</m:t>
+        </m:r>
+        <m:sSub>
+          <m:e>
+            <m:r>
+              <m:t>R</m:t>
+            </m:r>
+          </m:e>
+          <m:sub>
+            <m:r>
+              <m:t>i</m:t>
+            </m:r>
+            <m:r>
+              <m:rPr>
+                <m:sty m:val="p"/>
+              </m:rPr>
+              <m:t>|</m:t>
+            </m:r>
+            <m:r>
+              <m:t>t</m:t>
+            </m:r>
+          </m:sub>
+        </m:sSub>
+        <m:r>
+          <m:rPr>
+            <m:sty m:val="p"/>
+          </m:rPr>
+          <m:t>)</m:t>
+        </m:r>
+        <m:r>
+          <m:rPr>
+            <m:sty m:val="p"/>
+          </m:rPr>
+          <m:t>|</m:t>
+        </m:r>
+      </m:oMath>
+      <w:r>
+        <w:t xml:space="preserve"> </w:t>
+      </w:r>
+      <w:r>
+        <w:t xml:space="preserve">denote the absolute generalised concentration-index component in node</w:t>
+      </w:r>
+      <w:r>
+        <w:t xml:space="preserve"> </w:t>
+      </w:r>
+      <m:oMath>
+        <m:r>
+          <m:t>t</m:t>
+        </m:r>
+      </m:oMath>
+      <w:r>
+        <w:t xml:space="preserve">. Under the standard concentration index rule, the child-node impurity is relative to the child-node mean</w:t>
       </w:r>
     </w:p>
     <w:p>
@@ -11351,7 +11478,27 @@
         <w:pStyle w:val="FirstParagraph"/>
       </w:pPr>
       <w:r>
-        <w:t xml:space="preserve">The purpose of the inequality tree is to split the sample into subgroups where under-five mortality is no longer strongly concentrated by socioeconomic position. In an ideal terminal node, the selected inequality index would be close to zero. Model selection, therefore, evaluates how much of the root-node impurity is removed after partitioning, and how much impurity remains inside the terminal nodes. For a fitted tree, the remaining impurity is summarised by the weighted terminal-node impurity:</w:t>
+        <w:t xml:space="preserve">The purpose of the inequality tree is to split the sample into subgroups where under-five mortality is no longer strongly concentrated by socioeconomic position. Because the tree is an algorithmic partitioning method rather than a parametric regression model, I assess it by the apparent impurity reduction and by how well the fitted rules perform on held-out data</w:t>
+      </w:r>
+      <w:r>
+        <w:t xml:space="preserve"> </w:t>
+      </w:r>
+      <w:r>
+        <w:t xml:space="preserve">(</w:t>
+      </w:r>
+      <w:hyperlink w:anchor="ref-breiman2001two_cultures">
+        <w:r>
+          <w:rPr>
+            <w:rStyle w:val="Hyperlink"/>
+          </w:rPr>
+          <w:t xml:space="preserve">Breiman, 2001</w:t>
+        </w:r>
+      </w:hyperlink>
+      <w:r>
+        <w:t xml:space="preserve">)</w:t>
+      </w:r>
+      <w:r>
+        <w:t xml:space="preserve">. In an ideal terminal node, the selected inequality index would be close to zero. Model selection, therefore, evaluates how much of the root-node impurity is removed after partitioning, and how much impurity remains inside the terminal nodes.</w:t>
       </w:r>
     </w:p>
     <w:p>
@@ -12289,7 +12436,7 @@
         <w:t xml:space="preserve"> </w:t>
       </w:r>
       <w:r>
-        <w:t xml:space="preserve">is the tunning setting being evaluated,</w:t>
+        <w:t xml:space="preserve">is the tuning setting being evaluated,</w:t>
       </w:r>
       <w:r>
         <w:t xml:space="preserve"> </w:t>
@@ -12665,6 +12812,9 @@
       </w:pPr>
       <w:r>
         <w:t xml:space="preserve">Tree-based models, including random forests, can provide flexible predictions of health risk. This makes it hard to use them for decomposition, since the current decomposition methods rely on GLMs</w:t>
+      </w:r>
+      <w:r>
+        <w:t xml:space="preserve"> </w:t>
       </w:r>
       <w:r>
         <w:t xml:space="preserve">(</w:t>
@@ -18471,6 +18621,9 @@
         <w:t xml:space="preserve">This is identical to the Wagstaff contribution formula</w:t>
       </w:r>
       <w:r>
+        <w:t xml:space="preserve"> </w:t>
+      </w:r>
+      <w:r>
         <w:t xml:space="preserve">(</w:t>
       </w:r>
       <w:hyperlink w:anchor="ref-wagstaff2003decomposing">
@@ -18760,7 +18913,7 @@
         <w:t xml:space="preserve">)</w:t>
       </w:r>
       <w:r>
-        <w:t xml:space="preserve">. Because under-five deaths were rare relative to surviving children, the alive class was undersampled during model fitting to reduce class imbalance. The resulting forest was therefore used as a predictive scoring model rather than as a calibrated probability model. We then used the shapr R package to estimate SHAP contributions from the fitted forest</w:t>
+        <w:t xml:space="preserve">. Because under-five deaths were rare relative to surviving children, the alive class was undersampled during model fitting to reduce class imbalance. The resulting forest was therefore used as a predictive scoring model rather than as a calibrated probability model. We then used the fastshap R package to estimate SHAP contributions from the fitted forest</w:t>
       </w:r>
       <w:r>
         <w:t xml:space="preserve"> </w:t>
@@ -18768,32 +18921,12 @@
       <w:r>
         <w:t xml:space="preserve">(</w:t>
       </w:r>
-      <w:hyperlink w:anchor="ref-jullum2025shapr">
+      <w:hyperlink w:anchor="ref-fastshap2024">
         <w:r>
           <w:rPr>
             <w:rStyle w:val="Hyperlink"/>
           </w:rPr>
-          <w:t xml:space="preserve">Jullum</w:t>
-        </w:r>
-        <w:r>
-          <w:rPr>
-            <w:rStyle w:val="Hyperlink"/>
-          </w:rPr>
-          <w:t xml:space="preserve"> </w:t>
-        </w:r>
-        <w:r>
-          <w:rPr>
-            <w:rStyle w:val="Hyperlink"/>
-            <w:i/>
-            <w:iCs/>
-          </w:rPr>
-          <w:t xml:space="preserve">et al.</w:t>
-        </w:r>
-        <w:r>
-          <w:rPr>
-            <w:rStyle w:val="Hyperlink"/>
-          </w:rPr>
-          <w:t xml:space="preserve">, 2025</w:t>
+          <w:t xml:space="preserve">Greenwell, 2024</w:t>
         </w:r>
       </w:hyperlink>
       <w:r>
@@ -18858,7 +18991,7 @@
           <w:rPr>
             <w:rStyle w:val="Hyperlink"/>
           </w:rPr>
-          <w:t xml:space="preserve">tree the tree stopping rules section</w:t>
+          <w:t xml:space="preserve">tree stopping rules section</w:t>
         </w:r>
       </w:hyperlink>
       <w:r>
@@ -18870,7 +19003,7 @@
         <w:pStyle w:val="BodyText"/>
       </w:pPr>
       <w:r>
-        <w:t xml:space="preserve">For the concentration-index trees and forests, validation folds were created at the DHS primary sampling unit(PSU) level. All children from the same PSU were kept in the same fold. The model was fitted on the training PSUs and then evaluated on held-out PSUs using the same validation-gain measure. This was done because children in the same survey cluster may share local conditions and should not be treated as fully independent observations during validation. This follows the idea of blocked cross-validation for structured data</w:t>
+        <w:t xml:space="preserve">For the concentration-index trees and forests, validation folds were created at the DHS primary sampling unit (PSU) level. All children from the same PSU were kept in the same fold. The model was fitted on the training PSUs and then evaluated on held-out PSUs using the same validation-gain measure. This was done because children in the same survey cluster may share local conditions and should not be treated as fully independent observations during validation. This follows the idea of blocked cross-validation for structured data</w:t>
       </w:r>
       <w:r>
         <w:t xml:space="preserve"> </w:t>
@@ -18938,7 +19071,10 @@
         <w:pStyle w:val="FirstParagraph"/>
       </w:pPr>
       <w:r>
-        <w:t xml:space="preserve">In the DRC Data Set</w:t>
+        <w:t xml:space="preserve">In the DRC data set</w:t>
+      </w:r>
+      <w:r>
+        <w:t xml:space="preserve"> </w:t>
       </w:r>
       <w:r>
         <w:t xml:space="preserve">(</w:t>
@@ -19105,7 +19241,7 @@
         </w:r>
       </w:hyperlink>
       <w:r>
-        <w:t xml:space="preserve">). In the predictive-forest SHAP decomposition, the contributions were less concentrated in the education and occupation variables. Residence gave the largest SHAP contribution under CI, CIg, CIc, and L. Under CI, CIg, and CIc, residence contributed about 19%, followed by father’s agricultural occupation, household wealth, mother’s education, Maniema, mother’s agricultural occupation, and skilled birth attendance. Under L, residence was again the largest contributor, followed by father’s agricultural occupation, mother’s education, Maniema, mother’s agricultural occupation, Kinshasa, and household wealth. The fitted regression model is reported in</w:t>
+        <w:t xml:space="preserve">). In the predictive-forest SHAP decomposition, the contributions were less concentrated in the education and occupation variables. Residence gave the largest SHAP contribution under CI, CIg, CIc, and L. Under CI, CIg, and CIc, residence contributed about 19%, followed by father’s agricultural occupation, household wealth, mother’s education, Maniema, mother’s agricultural occupation, and skilled birth attendance. Under L, residence was again the largest contributor, followed by father’s agricultural occupation, mother’s education, Maniema, mother’s agricultural occupation, household wealth and Kinshasa. The fitted regression model is reported in</w:t>
       </w:r>
       <w:r>
         <w:t xml:space="preserve"> </w:t>
@@ -22314,13 +22450,7 @@
         <w:t xml:space="preserve">)</w:t>
       </w:r>
       <w:r>
-        <w:t xml:space="preserve">. This index is most appropriate when the socioeconomic variable has ratio-scale properties.</w:t>
-      </w:r>
-      <w:r>
-        <w:t xml:space="preserve"> </w:t>
-      </w:r>
-      <w:r>
-        <w:t xml:space="preserve">We treat it as a sensitivity analysis; the selected</w:t>
+        <w:t xml:space="preserve">. This index is most appropriate when the socioeconomic variable has ratio-scale properties. We treat it as a sensitivity analysis; the selected</w:t>
       </w:r>
       <w:r>
         <w:t xml:space="preserve"> </w:t>
@@ -22348,7 +22478,21 @@
         </w:r>
       </w:hyperlink>
       <w:r>
-        <w:t xml:space="preserve">. The lowest-mortality terminal group consists of urban children in Kinshasa whose fathers were not in agriculture, with an under-five mortality rate of about 5.1%. The highest-mortality terminal group consists of rural children living in low-wealth households in Katanga, with an under-five mortality rate of about 18.5%. Thus, the level-dependent tree tells a more spatial story of inequality: mortality risk is first organised by the rural-urban divide, then by occupation, wealth, and region. This structure differs from the rank-dependent trees, which first organise the fitted subgroups around maternal education and father’s agricultural occupation.</w:t>
+        <w:t xml:space="preserve">. The lowest-mortality terminal group consists of urban children in Kinshasa whose fathers were not in agriculture, with an under-five mortality rate of about 5.1%. The highest-mortality terminal group consists of rural children living in low-wealth households in Katanga, with an under-five mortality rate of about 18.5%. Thus, the level-dependent tree tells a more spatial story of inequality: mortality risk is first organised by the rural-urban divide, then by occupation, wealth, and region. This structure differs from the rank-dependent trees, which first organise the fitted subgroups around maternal education and father’s agricultural occupation. The full fitted tree also includes a short preceding birth-interval split among rural children in high-wealth households, so birth interval appears as a lower-branch refinement rather than as the main organising feature of the</w:t>
+      </w:r>
+      <w:r>
+        <w:t xml:space="preserve"> </w:t>
+      </w:r>
+      <m:oMath>
+        <m:r>
+          <m:t>L</m:t>
+        </m:r>
+      </m:oMath>
+      <w:r>
+        <w:t xml:space="preserve"> </w:t>
+      </w:r>
+      <w:r>
+        <w:t xml:space="preserve">tree.</w:t>
       </w:r>
     </w:p>
     <w:tbl>
@@ -24376,7 +24520,7 @@
         </w:r>
       </w:hyperlink>
       <w:r>
-        <w:t xml:space="preserve">) we see that the algorithm developed here did not find a meaningful structure and behaved as expected. This shows that the tree-growing rule does not create subgroup structure when the outcome and socioeconomic ranking are independent, since the tree uses concentraion index as an impurity measure, which measures how sociaeconomic ranking and outcome covary.</w:t>
+        <w:t xml:space="preserve">) we see that the algorithm developed here did not find a meaningful structure and behaved as expected. This shows that the tree-growing rule does not create subgroup structure when the outcome and socioeconomic ranking are independent, since the tree uses concentration index as an impurity measure, which measures how socioeconomic ranking and outcome covary.</w:t>
       </w:r>
     </w:p>
     <w:bookmarkStart w:id="119" w:name="fig-results-simulation-null-trees"/>
@@ -24781,7 +24925,7 @@
         <w:pStyle w:val="FirstParagraph"/>
       </w:pPr>
       <w:r>
-        <w:t xml:space="preserve">In the positive-control simulation, the method(the concentration index tree with</w:t>
+        <w:t xml:space="preserve">In the positive-control simulation, the method (the concentration index tree with</w:t>
       </w:r>
       <w:r>
         <w:t xml:space="preserve"> </w:t>
@@ -24899,7 +25043,7 @@
         <w:pStyle w:val="BodyText"/>
       </w:pPr>
       <w:r>
-        <w:t xml:space="preserve">We see the same pattern across the sensitivity plots in the appendix the trees developed using</w:t>
+        <w:t xml:space="preserve">We see the same pattern across the appendix sensitivity plots for the trees developed using</w:t>
       </w:r>
       <w:r>
         <w:t xml:space="preserve"> </w:t>
@@ -24937,31 +25081,14 @@
       </w:r>
       <m:oMath>
         <m:r>
-          <m:t>C</m:t>
-        </m:r>
-        <m:r>
-          <m:t>I</m:t>
-        </m:r>
-        <m:r>
-          <m:t>c</m:t>
+          <m:t>L</m:t>
         </m:r>
       </m:oMath>
       <w:r>
-        <w:t xml:space="preserve">, and</w:t>
-      </w:r>
-      <w:r>
-        <w:t xml:space="preserve"> </w:t>
-      </w:r>
-      <m:oMath>
-        <m:r>
-          <m:t>L</m:t>
-        </m:r>
-      </m:oMath>
-      <w:r>
-        <w:t xml:space="preserve"> </w:t>
-      </w:r>
-      <w:r>
-        <w:t xml:space="preserve">as impurity measures(</w:t>
+        <w:t xml:space="preserve"> </w:t>
+      </w:r>
+      <w:r>
+        <w:t xml:space="preserve">as impurity measures (</w:t>
       </w:r>
       <w:hyperlink w:anchor="Xb19a5d97e3e86bc9418a745e34d5880cb39e739">
         <w:r>
@@ -24977,7 +25104,7 @@
       <w:r>
         <w:t xml:space="preserve"> </w:t>
       </w:r>
-      <w:hyperlink w:anchor="Xf2e3d97d8c4306368157db2ee998b9240cd052e">
+      <w:hyperlink w:anchor="X5e7570d48fd3db880d12f7c285f7bea4384c08c">
         <w:r>
           <w:rPr>
             <w:rStyle w:val="Hyperlink"/>
@@ -25029,7 +25156,7 @@
         <w:pStyle w:val="FirstParagraph"/>
       </w:pPr>
       <w:r>
-        <w:t xml:space="preserve">This thesis developed a tree-based model for analysing socioeconomic inequality in under-five mortality using the concentration index impurity. In the DRC data, inequality in under-five mortality was not only a wealth pattern. Residence, maternal education, skilled birth attendance, parental occupation, household wealth, and province all appeared in the analysis. Overall, 10.32% of children died before age five. Deaths were more common among children from low-wealth households, rural households, mothers with no education, births without skilled attendance, and in some provinces, especially Katanga. A similar pattern appears in earlier work.</w:t>
+        <w:t xml:space="preserve">This thesis developed a tree-based method for analysing socioeconomic inequality in under-five mortality using the concentration index impurity. In the DRC data, under-five mortality inequality was not solely a function of household wealth. Residence, maternal education, skilled birth attendance, parental occupation, household wealth, and province all appeared in the results. Overall, 10.32% of children died before age five. Deaths were more common among children from low-wealth households, rural households, mothers with no education, births without skilled attendance, and in some provinces, especially Katanga. A similar pattern appears in earlier work.</w:t>
       </w:r>
       <w:r>
         <w:t xml:space="preserve"> </w:t>
@@ -25072,7 +25199,7 @@
         <w:t xml:space="preserve"> </w:t>
       </w:r>
       <w:r>
-        <w:t xml:space="preserve">reported geographic differences in under-five mortality in the DRC, and</w:t>
+        <w:t xml:space="preserve">reported geographic differences in under-five mortality in the DRC, while</w:t>
       </w:r>
       <w:r>
         <w:t xml:space="preserve"> </w:t>
@@ -25089,10 +25216,19 @@
         </w:r>
       </w:hyperlink>
       <w:r>
-        <w:t xml:space="preserve">;</w:t>
-      </w:r>
-      <w:r>
-        <w:t xml:space="preserve"> </w:t>
+        <w:t xml:space="preserve">)</w:t>
+      </w:r>
+      <w:r>
+        <w:t xml:space="preserve"> </w:t>
+      </w:r>
+      <w:r>
+        <w:t xml:space="preserve">and</w:t>
+      </w:r>
+      <w:r>
+        <w:t xml:space="preserve"> </w:t>
+      </w:r>
+      <w:r>
+        <w:t xml:space="preserve">(</w:t>
       </w:r>
       <w:hyperlink w:anchor="ref-vanmalderen2019socioeconomic">
         <w:r>
@@ -25126,7 +25262,10 @@
         <w:t xml:space="preserve">)</w:t>
       </w:r>
       <w:r>
-        <w:t xml:space="preserve"> reported wealth, education, residence, and occupation in decomposition studies of under-five mortality inequality in African settings</w:t>
+        <w:t xml:space="preserve"> </w:t>
+      </w:r>
+      <w:r>
+        <w:t xml:space="preserve">reported wealth, education, residence, and occupation in decomposition studies of under-five mortality inequality in African settings.</w:t>
       </w:r>
     </w:p>
     <w:p>
@@ -25134,61 +25273,7 @@
         <w:pStyle w:val="BodyText"/>
       </w:pPr>
       <w:r>
-        <w:t xml:space="preserve">The indirect methods yielded the variable-level results. In the regression-based decomposition, mother’s education had the largest contribution, followed by father’s agricultural occupation, mother’s agricultural occupation, household wealth, residence, and skilled birth attendance. This is close to earlier decomposition work, where household wealth, parental education, occupation, and residence were important for under-five mortality inequality</w:t>
-      </w:r>
-      <w:r>
-        <w:t xml:space="preserve"> </w:t>
-      </w:r>
-      <w:r>
-        <w:t xml:space="preserve">(</w:t>
-      </w:r>
-      <w:hyperlink w:anchor="ref-vanmalderen2013under5">
-        <w:r>
-          <w:rPr>
-            <w:rStyle w:val="Hyperlink"/>
-          </w:rPr>
-          <w:t xml:space="preserve">Van Malderen, Van Oyen and Speybroeck, 2013</w:t>
-        </w:r>
-      </w:hyperlink>
-      <w:r>
-        <w:t xml:space="preserve">;</w:t>
-      </w:r>
-      <w:r>
-        <w:t xml:space="preserve"> </w:t>
-      </w:r>
-      <w:hyperlink w:anchor="ref-vanmalderen2019socioeconomic">
-        <w:r>
-          <w:rPr>
-            <w:rStyle w:val="Hyperlink"/>
-          </w:rPr>
-          <w:t xml:space="preserve">Van Malderen</w:t>
-        </w:r>
-        <w:r>
-          <w:rPr>
-            <w:rStyle w:val="Hyperlink"/>
-          </w:rPr>
-          <w:t xml:space="preserve"> </w:t>
-        </w:r>
-        <w:r>
-          <w:rPr>
-            <w:rStyle w:val="Hyperlink"/>
-            <w:i/>
-            <w:iCs/>
-          </w:rPr>
-          <w:t xml:space="preserve">et al.</w:t>
-        </w:r>
-        <w:r>
-          <w:rPr>
-            <w:rStyle w:val="Hyperlink"/>
-          </w:rPr>
-          <w:t xml:space="preserve">, 2019</w:t>
-        </w:r>
-      </w:hyperlink>
-      <w:r>
-        <w:t xml:space="preserve">)</w:t>
-      </w:r>
-      <w:r>
-        <w:t xml:space="preserve">. The SHAP analysis from the fitted random forest was less concentrated on one or two variables. Residence was the largest SHAP contributor, while household wealth, parental occupation, mother’s education, skilled birth attendance, and some regional indicators also appeared across criteria. These SHAP results explain the fitted predictive model. They should not be interpreted as causal effects or as population-level determinants.</w:t>
+        <w:t xml:space="preserve">The indirect methods gave the variable-level results. In the regression decomposition, mother’s education had the largest contribution, followed by father’s agricultural occupation, mother’s agricultural occupation, household wealth, residence, and skilled birth attendance. The SHAP decomposition from the fitted random forest was less concentrated on one or two variables. Residence was the largest SHAP contributor, while household wealth, parental occupation, mother’s education, skilled birth attendance, and some regional indicators also appeared across criteria. These SHAP results explain the fitted predictive model. They should not be read as causal effects or as population-level contributions to under-five mortality.</w:t>
       </w:r>
     </w:p>
     <w:p>
@@ -25196,7 +25281,7 @@
         <w:pStyle w:val="BodyText"/>
       </w:pPr>
       <w:r>
-        <w:t xml:space="preserve">The direct concentration-index trees yielded the subgroup results. The indirect methods ranked variables by their contribution to inequality, while the trees showed how some of these variables appeared together in branches of the fitted tree. The</w:t>
+        <w:t xml:space="preserve">The direct concentration-index trees gave the subgroup results. The</w:t>
       </w:r>
       <w:r>
         <w:t xml:space="preserve"> </w:t>
@@ -25247,7 +25332,70 @@
         <w:t xml:space="preserve"> </w:t>
       </w:r>
       <w:r>
-        <w:t xml:space="preserve">trees mainly split through mother’s education, father’s agricultural occupation, skilled birth attendance, household wealth, and Katanga. Mortality was lower among children whose mothers had some education and whose fathers were not in agriculture. It was higher among children whose mothers had no education, who lived in low-wealth households, and who resided in Katanga.</w:t>
+        <w:t xml:space="preserve">trees mainly split through mother’s education, father’s agricultural occupation, skilled birth attendance, household wealth, and Katanga. Mortality was lower among children whose mothers had some education and whose fathers were not in agriculture. It was higher among children whose mothers had no education, who lived in low-wealth households, and who resided in Katanga. These branches are easier to read than a table of percentage contributions because they show how variables appeared together in the fitted data.</w:t>
+      </w:r>
+      <w:r>
+        <w:t xml:space="preserve"> </w:t>
+      </w:r>
+      <w:r>
+        <w:t xml:space="preserve">The rank-dependent trees fitted the training data much better than the held-out PSUs. In training, the</w:t>
+      </w:r>
+      <w:r>
+        <w:t xml:space="preserve"> </w:t>
+      </w:r>
+      <m:oMath>
+        <m:r>
+          <m:t>C</m:t>
+        </m:r>
+        <m:r>
+          <m:t>I</m:t>
+        </m:r>
+      </m:oMath>
+      <w:r>
+        <w:t xml:space="preserve"> </w:t>
+      </w:r>
+      <w:r>
+        <w:t xml:space="preserve">tree removed 83.3% of the root-node impurity, while the</w:t>
+      </w:r>
+      <w:r>
+        <w:t xml:space="preserve"> </w:t>
+      </w:r>
+      <m:oMath>
+        <m:r>
+          <m:t>C</m:t>
+        </m:r>
+        <m:r>
+          <m:t>I</m:t>
+        </m:r>
+        <m:r>
+          <m:t>c</m:t>
+        </m:r>
+      </m:oMath>
+      <w:r>
+        <w:t xml:space="preserve"> </w:t>
+      </w:r>
+      <w:r>
+        <w:t xml:space="preserve">and</w:t>
+      </w:r>
+      <w:r>
+        <w:t xml:space="preserve"> </w:t>
+      </w:r>
+      <m:oMath>
+        <m:r>
+          <m:t>C</m:t>
+        </m:r>
+        <m:r>
+          <m:t>I</m:t>
+        </m:r>
+        <m:r>
+          <m:t>g</m:t>
+        </m:r>
+      </m:oMath>
+      <w:r>
+        <w:t xml:space="preserve"> </w:t>
+      </w:r>
+      <w:r>
+        <w:t xml:space="preserve">trees removed 81.6%. In validation, the gains were negative. This means that the same branches did not reduce concentration-index impurity when applied to PSUs that were not used to fit the tree.</w:t>
       </w:r>
     </w:p>
     <w:p>
@@ -25255,64 +25403,35 @@
         <w:pStyle w:val="BodyText"/>
       </w:pPr>
       <w:r>
-        <w:t xml:space="preserve">These rank-dependent trees fitted the training data much better than the held-out PSUs. In training, the</w:t>
+        <w:t xml:space="preserve">The</w:t>
       </w:r>
       <w:r>
         <w:t xml:space="preserve"> </w:t>
       </w:r>
       <m:oMath>
         <m:r>
-          <m:t>C</m:t>
-        </m:r>
-        <m:r>
-          <m:t>I</m:t>
+          <m:t>L</m:t>
         </m:r>
       </m:oMath>
       <w:r>
         <w:t xml:space="preserve"> </w:t>
       </w:r>
       <w:r>
-        <w:t xml:space="preserve">tree removed 83.3% of the root-node impurity, while the</w:t>
+        <w:t xml:space="preserve">tree gave a different result. It was split first by residence, then by father’s agricultural occupation, household wealth, birth interval, and province. This structure had positive validation gain, unlike the rank-dependent trees. This made the</w:t>
       </w:r>
       <w:r>
         <w:t xml:space="preserve"> </w:t>
       </w:r>
       <m:oMath>
         <m:r>
-          <m:t>C</m:t>
-        </m:r>
-        <m:r>
-          <m:t>I</m:t>
-        </m:r>
-        <m:r>
-          <m:t>c</m:t>
+          <m:t>L</m:t>
         </m:r>
       </m:oMath>
       <w:r>
         <w:t xml:space="preserve"> </w:t>
       </w:r>
       <w:r>
-        <w:t xml:space="preserve">and</w:t>
-      </w:r>
-      <w:r>
-        <w:t xml:space="preserve"> </w:t>
-      </w:r>
-      <m:oMath>
-        <m:r>
-          <m:t>C</m:t>
-        </m:r>
-        <m:r>
-          <m:t>I</m:t>
-        </m:r>
-        <m:r>
-          <m:t>g</m:t>
-        </m:r>
-      </m:oMath>
-      <w:r>
-        <w:t xml:space="preserve"> </w:t>
-      </w:r>
-      <w:r>
-        <w:t xml:space="preserve">trees removed 81.6%. In validation, the gains were negative. This means that the same branches did not reduce concentration-index impurity when applied to PSUs that were not used to fit the tree.</w:t>
+        <w:t xml:space="preserve">result more stable in this application. It should still be read as a sensitivity result because the DHS wealth index is a PCA-derived asset score, not a ratio-scale measure such as income, consumption, or expenditure.</w:t>
       </w:r>
     </w:p>
     <w:bookmarkEnd w:id="128"/>
@@ -25992,7 +26111,7 @@
         <w:pStyle w:val="BodyText"/>
       </w:pPr>
       <w:r>
-        <w:t xml:space="preserve">Compared with GLM based decomposition, tree-based models are easier to interpret. The variable percentage contribution from regression or Shap-based decomposition can show which variables contribute more. However, it cannot show how disadvantage is organised across residence, household wealth, occupation, maternal background, and province. A tree is easier to discuss because it works like a flow chart. As shown in this thesis, the tree partitions the data graphically into high- and low-risk groups. Concentration index trees make it easier to follow the path to these high- and low-risk groups and identify them for public health planning. This makes tree models useful in public health and policy contexts, where the goal is to identify groups for targeted interventions. They are also easy to interpret for non-technical groups.</w:t>
+        <w:t xml:space="preserve">Compared with GLM-based decomposition, tree-based models are easier to interpret. The variable percentage contribution from regression or SHAP-based decomposition can show which variables contribute more. However, it cannot show how disadvantage is organised across residence, household wealth, occupation, maternal background, and province. A tree is easier to discuss because it works like a flow chart. As shown in this thesis, the tree partitions the data graphically into high- and low-risk groups. Concentration index trees make it easier to follow the path to these high- and low-risk groups and identify them for public health planning. This makes tree models useful in public health and policy contexts, where the goal is to identify groups for targeted interventions. They are also easy to interpret for non-technical groups.</w:t>
       </w:r>
     </w:p>
     <w:bookmarkEnd w:id="131"/>
@@ -26178,7 +26297,7 @@
       </w:r>
     </w:p>
     <w:bookmarkEnd w:id="134"/>
-    <w:bookmarkStart w:id="199" w:name="sec-references"/>
+    <w:bookmarkStart w:id="201" w:name="sec-references"/>
     <w:p>
       <w:pPr>
         <w:pStyle w:val="Heading1"/>
@@ -26187,7 +26306,7 @@
         <w:t xml:space="preserve">References</w:t>
       </w:r>
     </w:p>
-    <w:bookmarkStart w:id="198" w:name="refs"/>
+    <w:bookmarkStart w:id="200" w:name="refs"/>
     <w:bookmarkStart w:id="136" w:name="ref-breiman1984classification"/>
     <w:p>
       <w:pPr>
@@ -26241,7 +26360,53 @@
       </w:r>
     </w:p>
     <w:bookmarkEnd w:id="136"/>
-    <w:bookmarkStart w:id="138" w:name="ref-rineq2025"/>
+    <w:bookmarkStart w:id="138" w:name="ref-breiman2001two_cultures"/>
+    <w:p>
+      <w:pPr>
+        <w:pStyle w:val="Bibliography"/>
+      </w:pPr>
+      <w:r>
+        <w:t xml:space="preserve">Breiman, L. (2001)</w:t>
+      </w:r>
+      <w:r>
+        <w:t xml:space="preserve"> </w:t>
+      </w:r>
+      <w:r>
+        <w:t xml:space="preserve">‘Statistical modeling: The two cultures’</w:t>
+      </w:r>
+      <w:r>
+        <w:t xml:space="preserve">,</w:t>
+      </w:r>
+      <w:r>
+        <w:t xml:space="preserve"> </w:t>
+      </w:r>
+      <w:r>
+        <w:rPr>
+          <w:i/>
+          <w:iCs/>
+        </w:rPr>
+        <w:t xml:space="preserve">Statistical Science</w:t>
+      </w:r>
+      <w:r>
+        <w:t xml:space="preserve">, 16(3), pp. 199–231. Available at:</w:t>
+      </w:r>
+      <w:r>
+        <w:t xml:space="preserve"> </w:t>
+      </w:r>
+      <w:hyperlink r:id="rId137">
+        <w:r>
+          <w:rPr>
+            <w:rStyle w:val="Hyperlink"/>
+          </w:rPr>
+          <w:t xml:space="preserve">https://doi.org/10.1214/ss/1009213726</w:t>
+        </w:r>
+      </w:hyperlink>
+      <w:r>
+        <w:t xml:space="preserve">.</w:t>
+      </w:r>
+    </w:p>
+    <w:bookmarkEnd w:id="138"/>
+    <w:bookmarkStart w:id="140" w:name="ref-rineq2025"/>
     <w:p>
       <w:pPr>
         <w:pStyle w:val="Bibliography"/>
@@ -26281,7 +26446,7 @@
       <w:r>
         <w:t xml:space="preserve"> </w:t>
       </w:r>
-      <w:hyperlink r:id="rId137">
+      <w:hyperlink r:id="rId139">
         <w:r>
           <w:rPr>
             <w:rStyle w:val="Hyperlink"/>
@@ -26293,8 +26458,8 @@
         <w:t xml:space="preserve">.</w:t>
       </w:r>
     </w:p>
-    <w:bookmarkEnd w:id="138"/>
-    <w:bookmarkStart w:id="140" w:name="X4430d166a56c877cb70b80a274aa3f5190cd557"/>
+    <w:bookmarkEnd w:id="140"/>
+    <w:bookmarkStart w:id="142" w:name="X4430d166a56c877cb70b80a274aa3f5190cd557"/>
     <w:p>
       <w:pPr>
         <w:pStyle w:val="Bibliography"/>
@@ -26327,7 +26492,7 @@
       <w:r>
         <w:t xml:space="preserve"> </w:t>
       </w:r>
-      <w:hyperlink r:id="rId139">
+      <w:hyperlink r:id="rId141">
         <w:r>
           <w:rPr>
             <w:rStyle w:val="Hyperlink"/>
@@ -26339,8 +26504,8 @@
         <w:t xml:space="preserve">.</w:t>
       </w:r>
     </w:p>
-    <w:bookmarkEnd w:id="140"/>
-    <w:bookmarkStart w:id="142" w:name="ref-erreygers2009correcting"/>
+    <w:bookmarkEnd w:id="142"/>
+    <w:bookmarkStart w:id="144" w:name="ref-erreygers2009correcting"/>
     <w:p>
       <w:pPr>
         <w:pStyle w:val="Bibliography"/>
@@ -26373,7 +26538,7 @@
       <w:r>
         <w:t xml:space="preserve"> </w:t>
       </w:r>
-      <w:hyperlink r:id="rId141">
+      <w:hyperlink r:id="rId143">
         <w:r>
           <w:rPr>
             <w:rStyle w:val="Hyperlink"/>
@@ -26385,8 +26550,8 @@
         <w:t xml:space="preserve">.</w:t>
       </w:r>
     </w:p>
-    <w:bookmarkEnd w:id="142"/>
-    <w:bookmarkStart w:id="144" w:name="ref-erreygers2017subgroup"/>
+    <w:bookmarkEnd w:id="144"/>
+    <w:bookmarkStart w:id="146" w:name="ref-erreygers2017subgroup"/>
     <w:p>
       <w:pPr>
         <w:pStyle w:val="Bibliography"/>
@@ -26438,7 +26603,7 @@
       <w:r>
         <w:t xml:space="preserve"> </w:t>
       </w:r>
-      <w:hyperlink r:id="rId143">
+      <w:hyperlink r:id="rId145">
         <w:r>
           <w:rPr>
             <w:rStyle w:val="Hyperlink"/>
@@ -26450,8 +26615,8 @@
         <w:t xml:space="preserve">.</w:t>
       </w:r>
     </w:p>
-    <w:bookmarkEnd w:id="144"/>
-    <w:bookmarkStart w:id="146" w:name="ref-erreygers2017socioeconomic"/>
+    <w:bookmarkEnd w:id="146"/>
+    <w:bookmarkStart w:id="148" w:name="ref-erreygers2017socioeconomic"/>
     <w:p>
       <w:pPr>
         <w:pStyle w:val="Bibliography"/>
@@ -26484,7 +26649,7 @@
       <w:r>
         <w:t xml:space="preserve"> </w:t>
       </w:r>
-      <w:hyperlink r:id="rId145">
+      <w:hyperlink r:id="rId147">
         <w:r>
           <w:rPr>
             <w:rStyle w:val="Hyperlink"/>
@@ -26496,8 +26661,45 @@
         <w:t xml:space="preserve">.</w:t>
       </w:r>
     </w:p>
-    <w:bookmarkEnd w:id="146"/>
-    <w:bookmarkStart w:id="148" w:name="ref-hastie2009elements"/>
+    <w:bookmarkEnd w:id="148"/>
+    <w:bookmarkStart w:id="150" w:name="ref-fastshap2024"/>
+    <w:p>
+      <w:pPr>
+        <w:pStyle w:val="Bibliography"/>
+      </w:pPr>
+      <w:r>
+        <w:t xml:space="preserve">Greenwell, B. (2024)</w:t>
+      </w:r>
+      <w:r>
+        <w:t xml:space="preserve"> </w:t>
+      </w:r>
+      <w:r>
+        <w:rPr>
+          <w:i/>
+          <w:iCs/>
+        </w:rPr>
+        <w:t xml:space="preserve">Fastshap: Fast approximate shapley values</w:t>
+      </w:r>
+      <w:r>
+        <w:t xml:space="preserve">. Available at:</w:t>
+      </w:r>
+      <w:r>
+        <w:t xml:space="preserve"> </w:t>
+      </w:r>
+      <w:hyperlink r:id="rId149">
+        <w:r>
+          <w:rPr>
+            <w:rStyle w:val="Hyperlink"/>
+          </w:rPr>
+          <w:t xml:space="preserve">https://doi.org/10.32614/CRAN.package.fastshap</w:t>
+        </w:r>
+      </w:hyperlink>
+      <w:r>
+        <w:t xml:space="preserve">.</w:t>
+      </w:r>
+    </w:p>
+    <w:bookmarkEnd w:id="150"/>
+    <w:bookmarkStart w:id="152" w:name="ref-hastie2009elements"/>
     <w:p>
       <w:pPr>
         <w:pStyle w:val="Bibliography"/>
@@ -26521,7 +26723,7 @@
       <w:r>
         <w:t xml:space="preserve"> </w:t>
       </w:r>
-      <w:hyperlink r:id="rId147">
+      <w:hyperlink r:id="rId151">
         <w:r>
           <w:rPr>
             <w:rStyle w:val="Hyperlink"/>
@@ -26533,8 +26735,8 @@
         <w:t xml:space="preserve">.</w:t>
       </w:r>
     </w:p>
-    <w:bookmarkEnd w:id="148"/>
-    <w:bookmarkStart w:id="150" w:name="ref-hothorn2015partykit"/>
+    <w:bookmarkEnd w:id="152"/>
+    <w:bookmarkStart w:id="154" w:name="ref-hothorn2015partykit"/>
     <w:p>
       <w:pPr>
         <w:pStyle w:val="Bibliography"/>
@@ -26582,7 +26784,7 @@
       <w:r>
         <w:t xml:space="preserve"> </w:t>
       </w:r>
-      <w:hyperlink r:id="rId149">
+      <w:hyperlink r:id="rId153">
         <w:r>
           <w:rPr>
             <w:rStyle w:val="Hyperlink"/>
@@ -26594,8 +26796,8 @@
         <w:t xml:space="preserve">.</w:t>
       </w:r>
     </w:p>
-    <w:bookmarkEnd w:id="150"/>
-    <w:bookmarkStart w:id="152" w:name="ref-jones2003_child_survival"/>
+    <w:bookmarkEnd w:id="154"/>
+    <w:bookmarkStart w:id="156" w:name="ref-jones2003_child_survival"/>
     <w:p>
       <w:pPr>
         <w:pStyle w:val="Bibliography"/>
@@ -26644,7 +26846,7 @@
       <w:r>
         <w:t xml:space="preserve"> </w:t>
       </w:r>
-      <w:hyperlink r:id="rId151">
+      <w:hyperlink r:id="rId155">
         <w:r>
           <w:rPr>
             <w:rStyle w:val="Hyperlink"/>
@@ -26656,85 +26858,8 @@
         <w:t xml:space="preserve">.</w:t>
       </w:r>
     </w:p>
-    <w:bookmarkEnd w:id="152"/>
-    <w:bookmarkStart w:id="154" w:name="ref-jullum2025shapr"/>
-    <w:p>
-      <w:pPr>
-        <w:pStyle w:val="Bibliography"/>
-      </w:pPr>
-      <w:r>
-        <w:t xml:space="preserve">Jullum, M.</w:t>
-      </w:r>
-      <w:r>
-        <w:t xml:space="preserve"> </w:t>
-      </w:r>
-      <w:r>
-        <w:rPr>
-          <w:i/>
-          <w:iCs/>
-        </w:rPr>
-        <w:t xml:space="preserve">et al.</w:t>
-      </w:r>
-      <w:r>
-        <w:t xml:space="preserve"> </w:t>
-      </w:r>
-      <w:r>
-        <w:t xml:space="preserve">(2025)</w:t>
-      </w:r>
-      <w:r>
-        <w:t xml:space="preserve"> </w:t>
-      </w:r>
-      <w:r>
-        <w:t xml:space="preserve">‘Shapr: Explaining machine learning models with conditional shapley values in</w:t>
-      </w:r>
-      <w:r>
-        <w:t xml:space="preserve"> </w:t>
-      </w:r>
-      <w:r>
-        <w:t xml:space="preserve">R</w:t>
-      </w:r>
-      <w:r>
-        <w:t xml:space="preserve"> </w:t>
-      </w:r>
-      <w:r>
-        <w:t xml:space="preserve">and python’</w:t>
-      </w:r>
-      <w:r>
-        <w:t xml:space="preserve">,</w:t>
-      </w:r>
-      <w:r>
-        <w:t xml:space="preserve"> </w:t>
-      </w:r>
-      <w:r>
-        <w:rPr>
-          <w:i/>
-          <w:iCs/>
-        </w:rPr>
-        <w:t xml:space="preserve">arXiv preprint arXiv:2504.01842</w:t>
-      </w:r>
-      <w:r>
-        <w:t xml:space="preserve"> </w:t>
-      </w:r>
-      <w:r>
-        <w:t xml:space="preserve">[Preprint]. Available at:</w:t>
-      </w:r>
-      <w:r>
-        <w:t xml:space="preserve"> </w:t>
-      </w:r>
-      <w:hyperlink r:id="rId153">
-        <w:r>
-          <w:rPr>
-            <w:rStyle w:val="Hyperlink"/>
-          </w:rPr>
-          <w:t xml:space="preserve">https://arxiv.org/abs/2504.01842</w:t>
-        </w:r>
-      </w:hyperlink>
-      <w:r>
-        <w:t xml:space="preserve">.</w:t>
-      </w:r>
-    </w:p>
-    <w:bookmarkEnd w:id="154"/>
-    <w:bookmarkStart w:id="156" w:name="ref-kakwani1997socioeconomic"/>
+    <w:bookmarkEnd w:id="156"/>
+    <w:bookmarkStart w:id="158" w:name="ref-kakwani1997socioeconomic"/>
     <w:p>
       <w:pPr>
         <w:pStyle w:val="Bibliography"/>
@@ -26773,7 +26898,7 @@
       <w:r>
         <w:t xml:space="preserve"> </w:t>
       </w:r>
-      <w:hyperlink r:id="rId155">
+      <w:hyperlink r:id="rId157">
         <w:r>
           <w:rPr>
             <w:rStyle w:val="Hyperlink"/>
@@ -26785,8 +26910,8 @@
         <w:t xml:space="preserve">.</w:t>
       </w:r>
     </w:p>
-    <w:bookmarkEnd w:id="156"/>
-    <w:bookmarkStart w:id="158" w:name="ref-kandala2014drc"/>
+    <w:bookmarkEnd w:id="158"/>
+    <w:bookmarkStart w:id="160" w:name="ref-kandala2014drc"/>
     <w:p>
       <w:pPr>
         <w:pStyle w:val="Bibliography"/>
@@ -26835,7 +26960,7 @@
       <w:r>
         <w:t xml:space="preserve"> </w:t>
       </w:r>
-      <w:hyperlink r:id="rId157">
+      <w:hyperlink r:id="rId159">
         <w:r>
           <w:rPr>
             <w:rStyle w:val="Hyperlink"/>
@@ -26847,8 +26972,8 @@
         <w:t xml:space="preserve">.</w:t>
       </w:r>
     </w:p>
-    <w:bookmarkEnd w:id="158"/>
-    <w:bookmarkStart w:id="160" w:name="ref-tidymodels2020"/>
+    <w:bookmarkEnd w:id="160"/>
+    <w:bookmarkStart w:id="162" w:name="ref-tidymodels2020"/>
     <w:p>
       <w:pPr>
         <w:pStyle w:val="Bibliography"/>
@@ -26872,7 +26997,7 @@
       <w:r>
         <w:t xml:space="preserve"> </w:t>
       </w:r>
-      <w:hyperlink r:id="rId159">
+      <w:hyperlink r:id="rId161">
         <w:r>
           <w:rPr>
             <w:rStyle w:val="Hyperlink"/>
@@ -26884,8 +27009,8 @@
         <w:t xml:space="preserve">.</w:t>
       </w:r>
     </w:p>
-    <w:bookmarkEnd w:id="160"/>
-    <w:bookmarkStart w:id="161" w:name="ref-survey2026"/>
+    <w:bookmarkEnd w:id="162"/>
+    <w:bookmarkStart w:id="163" w:name="ref-survey2026"/>
     <w:p>
       <w:pPr>
         <w:pStyle w:val="Bibliography"/>
@@ -26907,8 +27032,8 @@
         <w:t xml:space="preserve">.</w:t>
       </w:r>
     </w:p>
-    <w:bookmarkEnd w:id="161"/>
-    <w:bookmarkStart w:id="163" w:name="ref-lundberg2018tree"/>
+    <w:bookmarkEnd w:id="163"/>
+    <w:bookmarkStart w:id="165" w:name="ref-lundberg2018tree"/>
     <w:p>
       <w:pPr>
         <w:pStyle w:val="Bibliography"/>
@@ -26944,7 +27069,7 @@
       <w:r>
         <w:t xml:space="preserve"> </w:t>
       </w:r>
-      <w:hyperlink r:id="rId162">
+      <w:hyperlink r:id="rId164">
         <w:r>
           <w:rPr>
             <w:rStyle w:val="Hyperlink"/>
@@ -26956,8 +27081,8 @@
         <w:t xml:space="preserve">.</w:t>
       </w:r>
     </w:p>
-    <w:bookmarkEnd w:id="163"/>
-    <w:bookmarkStart w:id="165" w:name="ref-lundberg2017unified"/>
+    <w:bookmarkEnd w:id="165"/>
+    <w:bookmarkStart w:id="167" w:name="ref-lundberg2017unified"/>
     <w:p>
       <w:pPr>
         <w:pStyle w:val="Bibliography"/>
@@ -26990,7 +27115,7 @@
       <w:r>
         <w:t xml:space="preserve"> </w:t>
       </w:r>
-      <w:hyperlink r:id="rId164">
+      <w:hyperlink r:id="rId166">
         <w:r>
           <w:rPr>
             <w:rStyle w:val="Hyperlink"/>
@@ -27002,8 +27127,8 @@
         <w:t xml:space="preserve">.</w:t>
       </w:r>
     </w:p>
-    <w:bookmarkEnd w:id="165"/>
-    <w:bookmarkStart w:id="167" w:name="ref-ineqTrees"/>
+    <w:bookmarkEnd w:id="167"/>
+    <w:bookmarkStart w:id="169" w:name="ref-ineqTrees"/>
     <w:p>
       <w:pPr>
         <w:pStyle w:val="Bibliography"/>
@@ -27027,7 +27152,7 @@
       <w:r>
         <w:t xml:space="preserve"> </w:t>
       </w:r>
-      <w:hyperlink r:id="rId166">
+      <w:hyperlink r:id="rId168">
         <w:r>
           <w:rPr>
             <w:rStyle w:val="Hyperlink"/>
@@ -27039,8 +27164,8 @@
         <w:t xml:space="preserve">.</w:t>
       </w:r>
     </w:p>
-    <w:bookmarkEnd w:id="167"/>
-    <w:bookmarkStart w:id="169" w:name="ref-roberts2017crossvalidation"/>
+    <w:bookmarkEnd w:id="169"/>
+    <w:bookmarkStart w:id="171" w:name="ref-roberts2017crossvalidation"/>
     <w:p>
       <w:pPr>
         <w:pStyle w:val="Bibliography"/>
@@ -27092,7 +27217,7 @@
       <w:r>
         <w:t xml:space="preserve"> </w:t>
       </w:r>
-      <w:hyperlink r:id="rId168">
+      <w:hyperlink r:id="rId170">
         <w:r>
           <w:rPr>
             <w:rStyle w:val="Hyperlink"/>
@@ -27104,8 +27229,8 @@
         <w:t xml:space="preserve">.</w:t>
       </w:r>
     </w:p>
-    <w:bookmarkEnd w:id="169"/>
-    <w:bookmarkStart w:id="171" w:name="ref-sharrow2022_under5_mortality"/>
+    <w:bookmarkEnd w:id="171"/>
+    <w:bookmarkStart w:id="173" w:name="ref-sharrow2022_under5_mortality"/>
     <w:p>
       <w:pPr>
         <w:pStyle w:val="Bibliography"/>
@@ -27154,7 +27279,7 @@
       <w:r>
         <w:t xml:space="preserve"> </w:t>
       </w:r>
-      <w:hyperlink r:id="rId170">
+      <w:hyperlink r:id="rId172">
         <w:r>
           <w:rPr>
             <w:rStyle w:val="Hyperlink"/>
@@ -27166,8 +27291,8 @@
         <w:t xml:space="preserve">.</w:t>
       </w:r>
     </w:p>
-    <w:bookmarkEnd w:id="171"/>
-    <w:bookmarkStart w:id="173" w:name="ref-speybroeck2010decomposing"/>
+    <w:bookmarkEnd w:id="173"/>
+    <w:bookmarkStart w:id="175" w:name="ref-speybroeck2010decomposing"/>
     <w:p>
       <w:pPr>
         <w:pStyle w:val="Bibliography"/>
@@ -27216,7 +27341,7 @@
       <w:r>
         <w:t xml:space="preserve"> </w:t>
       </w:r>
-      <w:hyperlink r:id="rId172">
+      <w:hyperlink r:id="rId174">
         <w:r>
           <w:rPr>
             <w:rStyle w:val="Hyperlink"/>
@@ -27228,8 +27353,8 @@
         <w:t xml:space="preserve">.</w:t>
       </w:r>
     </w:p>
-    <w:bookmarkEnd w:id="173"/>
-    <w:bookmarkStart w:id="175" w:name="ref-dhsprogram_wealth_index_construction"/>
+    <w:bookmarkEnd w:id="175"/>
+    <w:bookmarkStart w:id="177" w:name="ref-dhsprogram_wealth_index_construction"/>
     <w:p>
       <w:pPr>
         <w:pStyle w:val="Bibliography"/>
@@ -27249,7 +27374,7 @@
       <w:r>
         <w:t xml:space="preserve"> </w:t>
       </w:r>
-      <w:hyperlink r:id="rId174">
+      <w:hyperlink r:id="rId176">
         <w:r>
           <w:rPr>
             <w:rStyle w:val="Hyperlink"/>
@@ -27261,8 +27386,8 @@
         <w:t xml:space="preserve">.</w:t>
       </w:r>
     </w:p>
-    <w:bookmarkEnd w:id="175"/>
-    <w:bookmarkStart w:id="177" w:name="ref-dhs_privacy_respondents"/>
+    <w:bookmarkEnd w:id="177"/>
+    <w:bookmarkStart w:id="179" w:name="ref-dhs_privacy_respondents"/>
     <w:p>
       <w:pPr>
         <w:pStyle w:val="Bibliography"/>
@@ -27282,7 +27407,7 @@
       <w:r>
         <w:t xml:space="preserve"> </w:t>
       </w:r>
-      <w:hyperlink r:id="rId176">
+      <w:hyperlink r:id="rId178">
         <w:r>
           <w:rPr>
             <w:rStyle w:val="Hyperlink"/>
@@ -27294,8 +27419,8 @@
         <w:t xml:space="preserve">.</w:t>
       </w:r>
     </w:p>
-    <w:bookmarkEnd w:id="177"/>
-    <w:bookmarkStart w:id="179" w:name="ref-dhs_drc_2007_dataset"/>
+    <w:bookmarkEnd w:id="179"/>
+    <w:bookmarkStart w:id="181" w:name="ref-dhs_drc_2007_dataset"/>
     <w:p>
       <w:pPr>
         <w:pStyle w:val="Bibliography"/>
@@ -27321,7 +27446,7 @@
       <w:r>
         <w:t xml:space="preserve"> </w:t>
       </w:r>
-      <w:hyperlink r:id="rId178">
+      <w:hyperlink r:id="rId180">
         <w:r>
           <w:rPr>
             <w:rStyle w:val="Hyperlink"/>
@@ -27333,8 +27458,8 @@
         <w:t xml:space="preserve">.</w:t>
       </w:r>
     </w:p>
-    <w:bookmarkEnd w:id="179"/>
-    <w:bookmarkStart w:id="181" w:name="ref-rpart2026"/>
+    <w:bookmarkEnd w:id="181"/>
+    <w:bookmarkStart w:id="183" w:name="ref-rpart2026"/>
     <w:p>
       <w:pPr>
         <w:pStyle w:val="Bibliography"/>
@@ -27358,7 +27483,7 @@
       <w:r>
         <w:t xml:space="preserve"> </w:t>
       </w:r>
-      <w:hyperlink r:id="rId180">
+      <w:hyperlink r:id="rId182">
         <w:r>
           <w:rPr>
             <w:rStyle w:val="Hyperlink"/>
@@ -27370,8 +27495,8 @@
         <w:t xml:space="preserve">.</w:t>
       </w:r>
     </w:p>
-    <w:bookmarkEnd w:id="181"/>
-    <w:bookmarkStart w:id="183" w:name="ref-margins2024"/>
+    <w:bookmarkEnd w:id="183"/>
+    <w:bookmarkStart w:id="185" w:name="ref-margins2024"/>
     <w:p>
       <w:pPr>
         <w:pStyle w:val="Bibliography"/>
@@ -27395,7 +27520,7 @@
       <w:r>
         <w:t xml:space="preserve"> </w:t>
       </w:r>
-      <w:hyperlink r:id="rId182">
+      <w:hyperlink r:id="rId184">
         <w:r>
           <w:rPr>
             <w:rStyle w:val="Hyperlink"/>
@@ -27407,8 +27532,8 @@
         <w:t xml:space="preserve">.</w:t>
       </w:r>
     </w:p>
-    <w:bookmarkEnd w:id="183"/>
-    <w:bookmarkStart w:id="185" w:name="Xcfbd154e22107d15831b8a5ceb673d2557725b5"/>
+    <w:bookmarkEnd w:id="185"/>
+    <w:bookmarkStart w:id="187" w:name="Xcfbd154e22107d15831b8a5ceb673d2557725b5"/>
     <w:p>
       <w:pPr>
         <w:pStyle w:val="Bibliography"/>
@@ -27441,7 +27566,7 @@
       <w:r>
         <w:t xml:space="preserve"> </w:t>
       </w:r>
-      <w:hyperlink r:id="rId184">
+      <w:hyperlink r:id="rId186">
         <w:r>
           <w:rPr>
             <w:rStyle w:val="Hyperlink"/>
@@ -27453,8 +27578,8 @@
         <w:t xml:space="preserve">.</w:t>
       </w:r>
     </w:p>
-    <w:bookmarkEnd w:id="185"/>
-    <w:bookmarkStart w:id="187" w:name="ref-vanmalderen2019socioeconomic"/>
+    <w:bookmarkEnd w:id="187"/>
+    <w:bookmarkStart w:id="189" w:name="ref-vanmalderen2019socioeconomic"/>
     <w:p>
       <w:pPr>
         <w:pStyle w:val="Bibliography"/>
@@ -27503,7 +27628,7 @@
       <w:r>
         <w:t xml:space="preserve"> </w:t>
       </w:r>
-      <w:hyperlink r:id="rId186">
+      <w:hyperlink r:id="rId188">
         <w:r>
           <w:rPr>
             <w:rStyle w:val="Hyperlink"/>
@@ -27515,8 +27640,8 @@
         <w:t xml:space="preserve">.</w:t>
       </w:r>
     </w:p>
-    <w:bookmarkEnd w:id="187"/>
-    <w:bookmarkStart w:id="189" w:name="ref-vanmalderen2013under5"/>
+    <w:bookmarkEnd w:id="189"/>
+    <w:bookmarkStart w:id="191" w:name="ref-vanmalderen2013under5"/>
     <w:p>
       <w:pPr>
         <w:pStyle w:val="Bibliography"/>
@@ -27549,7 +27674,7 @@
       <w:r>
         <w:t xml:space="preserve"> </w:t>
       </w:r>
-      <w:hyperlink r:id="rId188">
+      <w:hyperlink r:id="rId190">
         <w:r>
           <w:rPr>
             <w:rStyle w:val="Hyperlink"/>
@@ -27561,8 +27686,8 @@
         <w:t xml:space="preserve">.</w:t>
       </w:r>
     </w:p>
-    <w:bookmarkEnd w:id="189"/>
-    <w:bookmarkStart w:id="191" w:name="ref-wagstaff2005bounds"/>
+    <w:bookmarkEnd w:id="191"/>
+    <w:bookmarkStart w:id="193" w:name="ref-wagstaff2005bounds"/>
     <w:p>
       <w:pPr>
         <w:pStyle w:val="Bibliography"/>
@@ -27595,7 +27720,7 @@
       <w:r>
         <w:t xml:space="preserve"> </w:t>
       </w:r>
-      <w:hyperlink r:id="rId190">
+      <w:hyperlink r:id="rId192">
         <w:r>
           <w:rPr>
             <w:rStyle w:val="Hyperlink"/>
@@ -27607,8 +27732,8 @@
         <w:t xml:space="preserve">.</w:t>
       </w:r>
     </w:p>
-    <w:bookmarkEnd w:id="191"/>
-    <w:bookmarkStart w:id="193" w:name="ref-wagstaff2003decomposing"/>
+    <w:bookmarkEnd w:id="193"/>
+    <w:bookmarkStart w:id="195" w:name="ref-wagstaff2003decomposing"/>
     <w:p>
       <w:pPr>
         <w:pStyle w:val="Bibliography"/>
@@ -27647,7 +27772,7 @@
       <w:r>
         <w:t xml:space="preserve"> </w:t>
       </w:r>
-      <w:hyperlink r:id="rId192">
+      <w:hyperlink r:id="rId194">
         <w:r>
           <w:rPr>
             <w:rStyle w:val="Hyperlink"/>
@@ -27659,8 +27784,8 @@
         <w:t xml:space="preserve">.</w:t>
       </w:r>
     </w:p>
-    <w:bookmarkEnd w:id="193"/>
-    <w:bookmarkStart w:id="195" w:name="ref-who_gho_under5_mortality_indicator"/>
+    <w:bookmarkEnd w:id="195"/>
+    <w:bookmarkStart w:id="197" w:name="ref-who_gho_under5_mortality_indicator"/>
     <w:p>
       <w:pPr>
         <w:pStyle w:val="Bibliography"/>
@@ -27684,7 +27809,7 @@
       <w:r>
         <w:t xml:space="preserve"> </w:t>
       </w:r>
-      <w:hyperlink r:id="rId194">
+      <w:hyperlink r:id="rId196">
         <w:r>
           <w:rPr>
             <w:rStyle w:val="Hyperlink"/>
@@ -27699,8 +27824,8 @@
         <w:t xml:space="preserve">(Accessed: 26 April 2026).</w:t>
       </w:r>
     </w:p>
-    <w:bookmarkEnd w:id="195"/>
-    <w:bookmarkStart w:id="197" w:name="ref-wright2017ranger"/>
+    <w:bookmarkEnd w:id="197"/>
+    <w:bookmarkStart w:id="199" w:name="ref-wright2017ranger"/>
     <w:p>
       <w:pPr>
         <w:pStyle w:val="Bibliography"/>
@@ -27754,7 +27879,7 @@
       <w:r>
         <w:t xml:space="preserve"> </w:t>
       </w:r>
-      <w:hyperlink r:id="rId196">
+      <w:hyperlink r:id="rId198">
         <w:r>
           <w:rPr>
             <w:rStyle w:val="Hyperlink"/>
@@ -27766,10 +27891,10 @@
         <w:t xml:space="preserve">.</w:t>
       </w:r>
     </w:p>
-    <w:bookmarkEnd w:id="197"/>
-    <w:bookmarkEnd w:id="198"/>
     <w:bookmarkEnd w:id="199"/>
-    <w:bookmarkStart w:id="200" w:name="generative-ai-disclosure"/>
+    <w:bookmarkEnd w:id="200"/>
+    <w:bookmarkEnd w:id="201"/>
+    <w:bookmarkStart w:id="202" w:name="generative-ai-disclosure"/>
     <w:p>
       <w:pPr>
         <w:pStyle w:val="Heading1"/>
@@ -27814,8 +27939,8 @@
         <w:t xml:space="preserve">I used ChatGPT to help develop custom tree plots, especially plots where each node displays wealth, sample size, and the outcome.</w:t>
       </w:r>
     </w:p>
-    <w:bookmarkEnd w:id="200"/>
-    <w:bookmarkStart w:id="300" w:name="sec-appendix"/>
+    <w:bookmarkEnd w:id="202"/>
+    <w:bookmarkStart w:id="302" w:name="sec-appendix"/>
     <w:p>
       <w:pPr>
         <w:pStyle w:val="Heading1"/>
@@ -27824,7 +27949,7 @@
         <w:t xml:space="preserve">Appendix</w:t>
       </w:r>
     </w:p>
-    <w:bookmarkStart w:id="201" w:name="code"/>
+    <w:bookmarkStart w:id="203" w:name="code"/>
     <w:p>
       <w:pPr>
         <w:pStyle w:val="Heading2"/>
@@ -27857,8 +27982,8 @@
         <w:t xml:space="preserve">The code for the concentration-index tree and forest implementation is available at https://github.com/m-mburu/ineqTrees</w:t>
       </w:r>
     </w:p>
-    <w:bookmarkEnd w:id="201"/>
-    <w:bookmarkStart w:id="202" w:name="app-centered-rank-proof"/>
+    <w:bookmarkEnd w:id="203"/>
+    <w:bookmarkStart w:id="204" w:name="app-centered-rank-proof"/>
     <w:p>
       <w:pPr>
         <w:pStyle w:val="Heading2"/>
@@ -29061,8 +29186,8 @@
         </m:oMath>
       </m:oMathPara>
     </w:p>
-    <w:bookmarkEnd w:id="202"/>
-    <w:bookmarkStart w:id="203" w:name="app-ci-cig-example"/>
+    <w:bookmarkEnd w:id="204"/>
+    <w:bookmarkStart w:id="205" w:name="app-ci-cig-example"/>
     <w:p>
       <w:pPr>
         <w:pStyle w:val="Heading2"/>
@@ -30359,8 +30484,8 @@
         <w:t xml:space="preserve">. This shows that relative and absolute inequality criteria can lead to different split choices.</w:t>
       </w:r>
     </w:p>
-    <w:bookmarkEnd w:id="203"/>
-    <w:bookmarkStart w:id="210" w:name="app-greedy-ci-tree-flow"/>
+    <w:bookmarkEnd w:id="205"/>
+    <w:bookmarkStart w:id="212" w:name="app-greedy-ci-tree-flow"/>
     <w:p>
       <w:pPr>
         <w:pStyle w:val="Heading2"/>
@@ -30369,7 +30494,7 @@
         <w:t xml:space="preserve">Greedy Concentration-Index Tree-Growing Procedure Flowchart</w:t>
       </w:r>
     </w:p>
-    <w:bookmarkStart w:id="204" w:name="algorithmic-summary"/>
+    <w:bookmarkStart w:id="206" w:name="algorithmic-summary"/>
     <w:p>
       <w:pPr>
         <w:pStyle w:val="Heading4"/>
@@ -31155,8 +31280,8 @@
         <w:t xml:space="preserve">.</w:t>
       </w:r>
     </w:p>
-    <w:bookmarkEnd w:id="204"/>
-    <w:bookmarkStart w:id="209" w:name="X73f23afa99a547d0d371f7cb7cac0900c5fb92e"/>
+    <w:bookmarkEnd w:id="206"/>
+    <w:bookmarkStart w:id="211" w:name="X73f23afa99a547d0d371f7cb7cac0900c5fb92e"/>
     <w:p>
       <w:pPr>
         <w:pStyle w:val="Heading3"/>
@@ -31178,7 +31303,7 @@
       <w:tr>
         <w:tc>
           <w:tcPr/>
-          <w:bookmarkStart w:id="208" w:name="fig-greedy-ci-tree-flow"/>
+          <w:bookmarkStart w:id="210" w:name="fig-greedy-ci-tree-flow"/>
           <w:p>
             <w:pPr>
               <w:jc w:val="center"/>
@@ -31188,18 +31313,18 @@
                 <wp:inline>
                   <wp:extent cx="4572000" cy="6400800"/>
                   <wp:effectExtent b="0" l="0" r="0" t="0"/>
-                  <wp:docPr descr="" title="" id="206" name="Picture"/>
+                  <wp:docPr descr="" title="" id="208" name="Picture"/>
                   <a:graphic>
                     <a:graphicData uri="http://schemas.openxmlformats.org/drawingml/2006/picture">
                       <pic:pic>
                         <pic:nvPicPr>
-                          <pic:cNvPr descr="MSE_Thesis_Decomposition_of_CI_Trees_MM_files\figure-docx\dot-figure-1.png" id="207" name="Picture"/>
+                          <pic:cNvPr descr="MSE_Thesis_Decomposition_of_CI_Trees_MM_files\figure-docx\dot-figure-1.png" id="209" name="Picture"/>
                           <pic:cNvPicPr>
                             <a:picLocks noChangeArrowheads="1" noChangeAspect="1"/>
                           </pic:cNvPicPr>
                         </pic:nvPicPr>
                         <pic:blipFill>
-                          <a:blip r:embed="rId205"/>
+                          <a:blip r:embed="rId207"/>
                           <a:stretch>
                             <a:fillRect/>
                           </a:stretch>
@@ -31239,13 +31364,13 @@
               <w:t xml:space="preserve">Figure 14: Greedy concentration-index tree-growing procedure.</w:t>
             </w:r>
           </w:p>
-          <w:bookmarkEnd w:id="208"/>
+          <w:bookmarkEnd w:id="210"/>
         </w:tc>
       </w:tr>
     </w:tbl>
-    <w:bookmarkEnd w:id="209"/>
-    <w:bookmarkEnd w:id="210"/>
-    <w:bookmarkStart w:id="299" w:name="results-1"/>
+    <w:bookmarkEnd w:id="211"/>
+    <w:bookmarkEnd w:id="212"/>
+    <w:bookmarkStart w:id="301" w:name="results-1"/>
     <w:p>
       <w:pPr>
         <w:pStyle w:val="Heading2"/>
@@ -31254,7 +31379,7 @@
         <w:t xml:space="preserve">Results</w:t>
       </w:r>
     </w:p>
-    <w:bookmarkStart w:id="216" w:name="appendix-r1-exploratory-data-outputs"/>
+    <w:bookmarkStart w:id="218" w:name="appendix-r1-exploratory-data-outputs"/>
     <w:p>
       <w:pPr>
         <w:pStyle w:val="Heading3"/>
@@ -31276,7 +31401,7 @@
       <w:tr>
         <w:tc>
           <w:tcPr/>
-          <w:bookmarkStart w:id="211" w:name="tbl-appendix-weighted-baseline"/>
+          <w:bookmarkStart w:id="213" w:name="tbl-appendix-weighted-baseline"/>
           <w:p>
             <w:pPr>
               <w:jc w:val="center"/>
@@ -33160,7 +33285,7 @@
               </w:tc>
             </w:tr>
           </w:tbl>
-          <w:bookmarkEnd w:id="211"/>
+          <w:bookmarkEnd w:id="213"/>
           <w:p/>
         </w:tc>
       </w:tr>
@@ -33178,7 +33303,7 @@
       <w:tr>
         <w:tc>
           <w:tcPr/>
-          <w:bookmarkStart w:id="215" w:name="Xae73381f5eabb14ee7a1a9401f1fbd7f28ab9ec"/>
+          <w:bookmarkStart w:id="217" w:name="Xae73381f5eabb14ee7a1a9401f1fbd7f28ab9ec"/>
           <w:p>
             <w:pPr>
               <w:pStyle w:val="Compact"/>
@@ -33189,18 +33314,18 @@
                 <wp:inline>
                   <wp:extent cx="5334000" cy="3593601"/>
                   <wp:effectExtent b="0" l="0" r="0" t="0"/>
-                  <wp:docPr descr="" title="" id="213" name="Picture"/>
+                  <wp:docPr descr="" title="" id="215" name="Picture"/>
                   <a:graphic>
                     <a:graphicData uri="http://schemas.openxmlformats.org/drawingml/2006/picture">
                       <pic:pic>
                         <pic:nvPicPr>
-                          <pic:cNvPr descr="MSE_Thesis_Decomposition_of_CI_Trees_MM_files/figure-docx/fig-appendix-province-mortality-distribution-1.pdf" id="214" name="Picture"/>
+                          <pic:cNvPr descr="MSE_Thesis_Decomposition_of_CI_Trees_MM_files/figure-docx/fig-appendix-province-mortality-distribution-1.pdf" id="216" name="Picture"/>
                           <pic:cNvPicPr>
                             <a:picLocks noChangeArrowheads="1" noChangeAspect="1"/>
                           </pic:cNvPicPr>
                         </pic:nvPicPr>
                         <pic:blipFill>
-                          <a:blip r:embed="rId212"/>
+                          <a:blip r:embed="rId214"/>
                           <a:stretch>
                             <a:fillRect/>
                           </a:stretch>
@@ -33240,12 +33365,12 @@
               <w:t xml:space="preserve">Figure 15: Weighted province distribution by under-five mortality status.</w:t>
             </w:r>
           </w:p>
-          <w:bookmarkEnd w:id="215"/>
+          <w:bookmarkEnd w:id="217"/>
         </w:tc>
       </w:tr>
     </w:tbl>
-    <w:bookmarkEnd w:id="216"/>
-    <w:bookmarkStart w:id="227" w:name="Xfa72af7bb6f61d0311166f547f01ea119790dac"/>
+    <w:bookmarkEnd w:id="218"/>
+    <w:bookmarkStart w:id="229" w:name="Xfa72af7bb6f61d0311166f547f01ea119790dac"/>
     <w:p>
       <w:pPr>
         <w:pStyle w:val="Heading3"/>
@@ -33254,7 +33379,7 @@
         <w:t xml:space="preserve">Appendix R2: Regression and Predictive-Forest Details</w:t>
       </w:r>
     </w:p>
-    <w:bookmarkStart w:id="218" w:name="regression-model-summary"/>
+    <w:bookmarkStart w:id="220" w:name="regression-model-summary"/>
     <w:p>
       <w:pPr>
         <w:pStyle w:val="Heading4"/>
@@ -33276,7 +33401,7 @@
       <w:tr>
         <w:tc>
           <w:tcPr/>
-          <w:bookmarkStart w:id="217" w:name="tbl-appendix-regression-model-summary"/>
+          <w:bookmarkStart w:id="219" w:name="tbl-appendix-regression-model-summary"/>
           <w:p>
             <w:pPr>
               <w:jc w:val="center"/>
@@ -35642,13 +35767,13 @@
               </w:tc>
             </w:tr>
           </w:tbl>
-          <w:bookmarkEnd w:id="217"/>
+          <w:bookmarkEnd w:id="219"/>
           <w:p/>
         </w:tc>
       </w:tr>
     </w:tbl>
-    <w:bookmarkEnd w:id="218"/>
-    <w:bookmarkStart w:id="221" w:name="predictive-ranger-tuning-results"/>
+    <w:bookmarkEnd w:id="220"/>
+    <w:bookmarkStart w:id="223" w:name="predictive-ranger-tuning-results"/>
     <w:p>
       <w:pPr>
         <w:pStyle w:val="Heading4"/>
@@ -35670,7 +35795,7 @@
       <w:tr>
         <w:tc>
           <w:tcPr/>
-          <w:bookmarkStart w:id="219" w:name="tbl-appendix-ranger-sampling-summary"/>
+          <w:bookmarkStart w:id="221" w:name="tbl-appendix-ranger-sampling-summary"/>
           <w:p>
             <w:pPr>
               <w:jc w:val="center"/>
@@ -36022,7 +36147,7 @@
               </w:tc>
             </w:tr>
           </w:tbl>
-          <w:bookmarkEnd w:id="219"/>
+          <w:bookmarkEnd w:id="221"/>
           <w:p/>
         </w:tc>
       </w:tr>
@@ -36048,7 +36173,7 @@
       <w:tr>
         <w:tc>
           <w:tcPr/>
-          <w:bookmarkStart w:id="220" w:name="tbl-appendix-ranger-cross-validation"/>
+          <w:bookmarkStart w:id="222" w:name="tbl-appendix-ranger-cross-validation"/>
           <w:p>
             <w:pPr>
               <w:jc w:val="center"/>
@@ -41337,13 +41462,13 @@
               </w:tc>
             </w:tr>
           </w:tbl>
-          <w:bookmarkEnd w:id="220"/>
+          <w:bookmarkEnd w:id="222"/>
           <w:p/>
         </w:tc>
       </w:tr>
     </w:tbl>
-    <w:bookmarkEnd w:id="221"/>
-    <w:bookmarkStart w:id="226" w:name="predictive-ranger-shap-summary-plot"/>
+    <w:bookmarkEnd w:id="223"/>
+    <w:bookmarkStart w:id="228" w:name="predictive-ranger-shap-summary-plot"/>
     <w:p>
       <w:pPr>
         <w:pStyle w:val="Heading4"/>
@@ -41365,7 +41490,7 @@
       <w:tr>
         <w:tc>
           <w:tcPr/>
-          <w:bookmarkStart w:id="225" w:name="fig-appendix-shap-summary"/>
+          <w:bookmarkStart w:id="227" w:name="fig-appendix-shap-summary"/>
           <w:p>
             <w:pPr>
               <w:pStyle w:val="Compact"/>
@@ -41376,18 +41501,18 @@
                 <wp:inline>
                   <wp:extent cx="5334000" cy="4305470"/>
                   <wp:effectExtent b="0" l="0" r="0" t="0"/>
-                  <wp:docPr descr="" title="" id="223" name="Picture"/>
+                  <wp:docPr descr="" title="" id="225" name="Picture"/>
                   <a:graphic>
                     <a:graphicData uri="http://schemas.openxmlformats.org/drawingml/2006/picture">
                       <pic:pic>
                         <pic:nvPicPr>
-                          <pic:cNvPr descr="MSE_Thesis_Decomposition_of_CI_Trees_MM_files/figure-docx/fig-appendix-shap-summary-1.pdf" id="224" name="Picture"/>
+                          <pic:cNvPr descr="MSE_Thesis_Decomposition_of_CI_Trees_MM_files/figure-docx/fig-appendix-shap-summary-1.pdf" id="226" name="Picture"/>
                           <pic:cNvPicPr>
                             <a:picLocks noChangeArrowheads="1" noChangeAspect="1"/>
                           </pic:cNvPicPr>
                         </pic:nvPicPr>
                         <pic:blipFill>
-                          <a:blip r:embed="rId222"/>
+                          <a:blip r:embed="rId224"/>
                           <a:stretch>
                             <a:fillRect/>
                           </a:stretch>
@@ -41427,13 +41552,13 @@
               <w:t xml:space="preserve">Figure 16: SHAP summary plot for the predictive ranger model.</w:t>
             </w:r>
           </w:p>
-          <w:bookmarkEnd w:id="225"/>
+          <w:bookmarkEnd w:id="227"/>
         </w:tc>
       </w:tr>
     </w:tbl>
-    <w:bookmarkEnd w:id="226"/>
-    <w:bookmarkEnd w:id="227"/>
-    <w:bookmarkStart w:id="238" w:name="Xc0cb797fc2fdf422f95146b8ada50cb6a8aaa8e"/>
+    <w:bookmarkEnd w:id="228"/>
+    <w:bookmarkEnd w:id="229"/>
+    <w:bookmarkStart w:id="240" w:name="Xc0cb797fc2fdf422f95146b8ada50cb6a8aaa8e"/>
     <w:p>
       <w:pPr>
         <w:pStyle w:val="Heading3"/>
@@ -41442,7 +41567,7 @@
         <w:t xml:space="preserve">Appendix R3: Concentration-Index Tree Details</w:t>
       </w:r>
     </w:p>
-    <w:bookmarkStart w:id="229" w:name="tree-tuning-and-selection-details"/>
+    <w:bookmarkStart w:id="231" w:name="tree-tuning-and-selection-details"/>
     <w:p>
       <w:pPr>
         <w:pStyle w:val="Heading4"/>
@@ -41464,7 +41589,7 @@
       <w:tr>
         <w:tc>
           <w:tcPr/>
-          <w:bookmarkStart w:id="228" w:name="tbl-appendix-tree-best-controls"/>
+          <w:bookmarkStart w:id="230" w:name="tbl-appendix-tree-best-controls"/>
           <w:p>
             <w:pPr>
               <w:jc w:val="center"/>
@@ -41938,13 +42063,13 @@
               </w:tc>
             </w:tr>
           </w:tbl>
-          <w:bookmarkEnd w:id="228"/>
+          <w:bookmarkEnd w:id="230"/>
           <w:p/>
         </w:tc>
       </w:tr>
     </w:tbl>
-    <w:bookmarkEnd w:id="229"/>
-    <w:bookmarkStart w:id="231" w:name="tree-fit-and-selection-summaries"/>
+    <w:bookmarkEnd w:id="231"/>
+    <w:bookmarkStart w:id="233" w:name="tree-fit-and-selection-summaries"/>
     <w:p>
       <w:pPr>
         <w:pStyle w:val="Heading4"/>
@@ -41966,7 +42091,7 @@
       <w:tr>
         <w:tc>
           <w:tcPr/>
-          <w:bookmarkStart w:id="230" w:name="X2ecc647078c6f204983c407a7f2a7522ea4dd98"/>
+          <w:bookmarkStart w:id="232" w:name="X2ecc647078c6f204983c407a7f2a7522ea4dd98"/>
           <w:p>
             <w:pPr>
               <w:jc w:val="center"/>
@@ -43056,13 +43181,13 @@
               </w:tc>
             </w:tr>
           </w:tbl>
-          <w:bookmarkEnd w:id="230"/>
+          <w:bookmarkEnd w:id="232"/>
           <w:p/>
         </w:tc>
       </w:tr>
     </w:tbl>
-    <w:bookmarkEnd w:id="231"/>
-    <w:bookmarkStart w:id="237" w:name="tree-selection-metrics"/>
+    <w:bookmarkEnd w:id="233"/>
+    <w:bookmarkStart w:id="239" w:name="tree-selection-metrics"/>
     <w:p>
       <w:pPr>
         <w:pStyle w:val="Heading4"/>
@@ -43084,7 +43209,7 @@
       <w:tr>
         <w:tc>
           <w:tcPr/>
-          <w:bookmarkStart w:id="232" w:name="tbl-appendix-tree-selection"/>
+          <w:bookmarkStart w:id="234" w:name="tbl-appendix-tree-selection"/>
           <w:p>
             <w:pPr>
               <w:jc w:val="center"/>
@@ -43558,7 +43683,7 @@
               </w:tc>
             </w:tr>
           </w:tbl>
-          <w:bookmarkEnd w:id="232"/>
+          <w:bookmarkEnd w:id="234"/>
           <w:p/>
         </w:tc>
       </w:tr>
@@ -43576,7 +43701,7 @@
       <w:tr>
         <w:tc>
           <w:tcPr/>
-          <w:bookmarkStart w:id="236" w:name="fig-appendix-tree-variable-importance"/>
+          <w:bookmarkStart w:id="238" w:name="fig-appendix-tree-variable-importance"/>
           <w:p>
             <w:pPr>
               <w:pStyle w:val="Compact"/>
@@ -43587,18 +43712,18 @@
                 <wp:inline>
                   <wp:extent cx="5334000" cy="4000500"/>
                   <wp:effectExtent b="0" l="0" r="0" t="0"/>
-                  <wp:docPr descr="" title="" id="234" name="Picture"/>
+                  <wp:docPr descr="" title="" id="236" name="Picture"/>
                   <a:graphic>
                     <a:graphicData uri="http://schemas.openxmlformats.org/drawingml/2006/picture">
                       <pic:pic>
                         <pic:nvPicPr>
-                          <pic:cNvPr descr="MSE_Thesis_Decomposition_of_CI_Trees_MM_files/figure-docx/fig-appendix-tree-variable-importance-1.pdf" id="235" name="Picture"/>
+                          <pic:cNvPr descr="MSE_Thesis_Decomposition_of_CI_Trees_MM_files/figure-docx/fig-appendix-tree-variable-importance-1.pdf" id="237" name="Picture"/>
                           <pic:cNvPicPr>
                             <a:picLocks noChangeArrowheads="1" noChangeAspect="1"/>
                           </pic:cNvPicPr>
                         </pic:nvPicPr>
                         <pic:blipFill>
-                          <a:blip r:embed="rId233"/>
+                          <a:blip r:embed="rId235"/>
                           <a:stretch>
                             <a:fillRect/>
                           </a:stretch>
@@ -43638,13 +43763,13 @@
               <w:t xml:space="preserve">Figure 17: Top tree variables by concentration-index criterion.</w:t>
             </w:r>
           </w:p>
-          <w:bookmarkEnd w:id="236"/>
+          <w:bookmarkEnd w:id="238"/>
         </w:tc>
       </w:tr>
     </w:tbl>
-    <w:bookmarkEnd w:id="237"/>
-    <w:bookmarkEnd w:id="238"/>
-    <w:bookmarkStart w:id="247" w:name="X5e3a14cdca8cd9a2af6b63f377ead2cc8f6815b"/>
+    <w:bookmarkEnd w:id="239"/>
+    <w:bookmarkEnd w:id="240"/>
+    <w:bookmarkStart w:id="249" w:name="X5e3a14cdca8cd9a2af6b63f377ead2cc8f6815b"/>
     <w:p>
       <w:pPr>
         <w:pStyle w:val="Heading3"/>
@@ -43666,7 +43791,7 @@
       <w:tr>
         <w:tc>
           <w:tcPr/>
-          <w:bookmarkStart w:id="242" w:name="fig-appendix-ci-tree-cig"/>
+          <w:bookmarkStart w:id="244" w:name="fig-appendix-ci-tree-cig"/>
           <w:p>
             <w:pPr>
               <w:pStyle w:val="Compact"/>
@@ -43677,18 +43802,18 @@
                 <wp:inline>
                   <wp:extent cx="5334000" cy="2963333"/>
                   <wp:effectExtent b="0" l="0" r="0" t="0"/>
-                  <wp:docPr descr="" title="" id="240" name="Picture"/>
+                  <wp:docPr descr="" title="" id="242" name="Picture"/>
                   <a:graphic>
                     <a:graphicData uri="http://schemas.openxmlformats.org/drawingml/2006/picture">
                       <pic:pic>
                         <pic:nvPicPr>
-                          <pic:cNvPr descr="MSE_Thesis_Decomposition_of_CI_Trees_MM_files/figure-docx/fig-appendix-ci-tree-cig-1.pdf" id="241" name="Picture"/>
+                          <pic:cNvPr descr="MSE_Thesis_Decomposition_of_CI_Trees_MM_files/figure-docx/fig-appendix-ci-tree-cig-1.pdf" id="243" name="Picture"/>
                           <pic:cNvPicPr>
                             <a:picLocks noChangeArrowheads="1" noChangeAspect="1"/>
                           </pic:cNvPicPr>
                         </pic:nvPicPr>
                         <pic:blipFill>
-                          <a:blip r:embed="rId239"/>
+                          <a:blip r:embed="rId241"/>
                           <a:stretch>
                             <a:fillRect/>
                           </a:stretch>
@@ -43728,7 +43853,7 @@
               <w:t xml:space="preserve">Figure 18: Concentration-index tree fitted with the CIg criterion.</w:t>
             </w:r>
           </w:p>
-          <w:bookmarkEnd w:id="242"/>
+          <w:bookmarkEnd w:id="244"/>
         </w:tc>
       </w:tr>
     </w:tbl>
@@ -43745,7 +43870,7 @@
       <w:tr>
         <w:tc>
           <w:tcPr/>
-          <w:bookmarkStart w:id="246" w:name="fig-appendix-ci-tree-ci"/>
+          <w:bookmarkStart w:id="248" w:name="fig-appendix-ci-tree-ci"/>
           <w:p>
             <w:pPr>
               <w:pStyle w:val="Compact"/>
@@ -43756,18 +43881,18 @@
                 <wp:inline>
                   <wp:extent cx="5334000" cy="2963333"/>
                   <wp:effectExtent b="0" l="0" r="0" t="0"/>
-                  <wp:docPr descr="" title="" id="244" name="Picture"/>
+                  <wp:docPr descr="" title="" id="246" name="Picture"/>
                   <a:graphic>
                     <a:graphicData uri="http://schemas.openxmlformats.org/drawingml/2006/picture">
                       <pic:pic>
                         <pic:nvPicPr>
-                          <pic:cNvPr descr="MSE_Thesis_Decomposition_of_CI_Trees_MM_files/figure-docx/fig-appendix-ci-tree-ci-1.pdf" id="245" name="Picture"/>
+                          <pic:cNvPr descr="MSE_Thesis_Decomposition_of_CI_Trees_MM_files/figure-docx/fig-appendix-ci-tree-ci-1.pdf" id="247" name="Picture"/>
                           <pic:cNvPicPr>
                             <a:picLocks noChangeArrowheads="1" noChangeAspect="1"/>
                           </pic:cNvPicPr>
                         </pic:nvPicPr>
                         <pic:blipFill>
-                          <a:blip r:embed="rId243"/>
+                          <a:blip r:embed="rId245"/>
                           <a:stretch>
                             <a:fillRect/>
                           </a:stretch>
@@ -43807,12 +43932,12 @@
               <w:t xml:space="preserve">Figure 19: Concentration-index tree fitted with the CI criterion.</w:t>
             </w:r>
           </w:p>
-          <w:bookmarkEnd w:id="246"/>
+          <w:bookmarkEnd w:id="248"/>
         </w:tc>
       </w:tr>
     </w:tbl>
-    <w:bookmarkEnd w:id="247"/>
-    <w:bookmarkStart w:id="252" w:name="Xb30d3992e15fbf177aa517b8089193849a355b6"/>
+    <w:bookmarkEnd w:id="249"/>
+    <w:bookmarkStart w:id="254" w:name="Xb30d3992e15fbf177aa517b8089193849a355b6"/>
     <w:p>
       <w:pPr>
         <w:pStyle w:val="Heading3"/>
@@ -43834,7 +43959,7 @@
       <w:tr>
         <w:tc>
           <w:tcPr/>
-          <w:bookmarkStart w:id="251" w:name="fig-appendix-lecturer-rpart-simple"/>
+          <w:bookmarkStart w:id="253" w:name="fig-appendix-lecturer-rpart-simple"/>
           <w:p>
             <w:pPr>
               <w:pStyle w:val="Compact"/>
@@ -43845,18 +43970,18 @@
                 <wp:inline>
                   <wp:extent cx="5334000" cy="3048000"/>
                   <wp:effectExtent b="0" l="0" r="0" t="0"/>
-                  <wp:docPr descr="" title="" id="249" name="Picture"/>
+                  <wp:docPr descr="" title="" id="251" name="Picture"/>
                   <a:graphic>
                     <a:graphicData uri="http://schemas.openxmlformats.org/drawingml/2006/picture">
                       <pic:pic>
                         <pic:nvPicPr>
-                          <pic:cNvPr descr="MSE_Thesis_Decomposition_of_CI_Trees_MM_files/figure-docx/fig-appendix-lecturer-rpart-simple-1.pdf" id="250" name="Picture"/>
+                          <pic:cNvPr descr="MSE_Thesis_Decomposition_of_CI_Trees_MM_files/figure-docx/fig-appendix-lecturer-rpart-simple-1.pdf" id="252" name="Picture"/>
                           <pic:cNvPicPr>
                             <a:picLocks noChangeArrowheads="1" noChangeAspect="1"/>
                           </pic:cNvPicPr>
                         </pic:nvPicPr>
                         <pic:blipFill>
-                          <a:blip r:embed="rId248"/>
+                          <a:blip r:embed="rId250"/>
                           <a:stretch>
                             <a:fillRect/>
                           </a:stretch>
@@ -43896,12 +44021,12 @@
               <w:t xml:space="preserve">Figure 20: Rpart comparison tree using absolute CI impurity.</w:t>
             </w:r>
           </w:p>
-          <w:bookmarkEnd w:id="251"/>
+          <w:bookmarkEnd w:id="253"/>
         </w:tc>
       </w:tr>
     </w:tbl>
-    <w:bookmarkEnd w:id="252"/>
-    <w:bookmarkStart w:id="285" w:name="X2b460e2210f6f21b836bd4ecef227d59560d020"/>
+    <w:bookmarkEnd w:id="254"/>
+    <w:bookmarkStart w:id="287" w:name="X2b460e2210f6f21b836bd4ecef227d59560d020"/>
     <w:p>
       <w:pPr>
         <w:pStyle w:val="Heading3"/>
@@ -43910,7 +44035,7 @@
         <w:t xml:space="preserve">Appendix 5: Concentration-Index Forest Details</w:t>
       </w:r>
     </w:p>
-    <w:bookmarkStart w:id="254" w:name="forest-tuning-and-selection-details"/>
+    <w:bookmarkStart w:id="256" w:name="forest-tuning-and-selection-details"/>
     <w:p>
       <w:pPr>
         <w:pStyle w:val="Heading4"/>
@@ -43932,7 +44057,7 @@
       <w:tr>
         <w:tc>
           <w:tcPr/>
-          <w:bookmarkStart w:id="253" w:name="tbl-appendix-forest-best-controls"/>
+          <w:bookmarkStart w:id="255" w:name="tbl-appendix-forest-best-controls"/>
           <w:p>
             <w:pPr>
               <w:jc w:val="center"/>
@@ -44528,13 +44653,13 @@
               </w:tc>
             </w:tr>
           </w:tbl>
-          <w:bookmarkEnd w:id="253"/>
+          <w:bookmarkEnd w:id="255"/>
           <w:p/>
         </w:tc>
       </w:tr>
     </w:tbl>
-    <w:bookmarkEnd w:id="254"/>
-    <w:bookmarkStart w:id="256" w:name="forest-fit-and-selection-summaries"/>
+    <w:bookmarkEnd w:id="256"/>
+    <w:bookmarkStart w:id="258" w:name="forest-fit-and-selection-summaries"/>
     <w:p>
       <w:pPr>
         <w:pStyle w:val="Heading4"/>
@@ -44556,7 +44681,7 @@
       <w:tr>
         <w:tc>
           <w:tcPr/>
-          <w:bookmarkStart w:id="255" w:name="Xbc8578b1a3ced7dc02b008838aaa5458e5149e7"/>
+          <w:bookmarkStart w:id="257" w:name="Xbc8578b1a3ced7dc02b008838aaa5458e5149e7"/>
           <w:p>
             <w:pPr>
               <w:jc w:val="center"/>
@@ -45646,13 +45771,13 @@
               </w:tc>
             </w:tr>
           </w:tbl>
-          <w:bookmarkEnd w:id="255"/>
+          <w:bookmarkEnd w:id="257"/>
           <w:p/>
         </w:tc>
       </w:tr>
     </w:tbl>
-    <w:bookmarkEnd w:id="256"/>
-    <w:bookmarkStart w:id="258" w:name="forest-selection-metrics"/>
+    <w:bookmarkEnd w:id="258"/>
+    <w:bookmarkStart w:id="260" w:name="forest-selection-metrics"/>
     <w:p>
       <w:pPr>
         <w:pStyle w:val="Heading4"/>
@@ -45674,7 +45799,7 @@
       <w:tr>
         <w:tc>
           <w:tcPr/>
-          <w:bookmarkStart w:id="257" w:name="tbl-appendix-forest-selection"/>
+          <w:bookmarkStart w:id="259" w:name="tbl-appendix-forest-selection"/>
           <w:p>
             <w:pPr>
               <w:jc w:val="center"/>
@@ -46148,13 +46273,13 @@
               </w:tc>
             </w:tr>
           </w:tbl>
-          <w:bookmarkEnd w:id="257"/>
+          <w:bookmarkEnd w:id="259"/>
           <w:p/>
         </w:tc>
       </w:tr>
     </w:tbl>
-    <w:bookmarkEnd w:id="258"/>
-    <w:bookmarkStart w:id="267" w:name="forest-complexity-plots"/>
+    <w:bookmarkEnd w:id="260"/>
+    <w:bookmarkStart w:id="269" w:name="forest-complexity-plots"/>
     <w:p>
       <w:pPr>
         <w:pStyle w:val="Heading4"/>
@@ -46176,7 +46301,7 @@
       <w:tr>
         <w:tc>
           <w:tcPr/>
-          <w:bookmarkStart w:id="262" w:name="fig-appendix-forest-complexity-path"/>
+          <w:bookmarkStart w:id="264" w:name="fig-appendix-forest-complexity-path"/>
           <w:p>
             <w:pPr>
               <w:pStyle w:val="Compact"/>
@@ -46187,18 +46312,18 @@
                 <wp:inline>
                   <wp:extent cx="5334000" cy="3214529"/>
                   <wp:effectExtent b="0" l="0" r="0" t="0"/>
-                  <wp:docPr descr="" title="" id="260" name="Picture"/>
+                  <wp:docPr descr="" title="" id="262" name="Picture"/>
                   <a:graphic>
                     <a:graphicData uri="http://schemas.openxmlformats.org/drawingml/2006/picture">
                       <pic:pic>
                         <pic:nvPicPr>
-                          <pic:cNvPr descr="MSE_Thesis_Decomposition_of_CI_Trees_MM_files/figure-docx/fig-appendix-forest-complexity-path-1.pdf" id="261" name="Picture"/>
+                          <pic:cNvPr descr="MSE_Thesis_Decomposition_of_CI_Trees_MM_files/figure-docx/fig-appendix-forest-complexity-path-1.pdf" id="263" name="Picture"/>
                           <pic:cNvPicPr>
                             <a:picLocks noChangeArrowheads="1" noChangeAspect="1"/>
                           </pic:cNvPicPr>
                         </pic:nvPicPr>
                         <pic:blipFill>
-                          <a:blip r:embed="rId259"/>
+                          <a:blip r:embed="rId261"/>
                           <a:stretch>
                             <a:fillRect/>
                           </a:stretch>
@@ -46238,7 +46363,7 @@
               <w:t xml:space="preserve">Figure 21: Forest complexity by number of terminal nodes.</w:t>
             </w:r>
           </w:p>
-          <w:bookmarkEnd w:id="262"/>
+          <w:bookmarkEnd w:id="264"/>
         </w:tc>
       </w:tr>
     </w:tbl>
@@ -46255,7 +46380,7 @@
       <w:tr>
         <w:tc>
           <w:tcPr/>
-          <w:bookmarkStart w:id="266" w:name="fig-appendix-forest-variable-importance"/>
+          <w:bookmarkStart w:id="268" w:name="fig-appendix-forest-variable-importance"/>
           <w:p>
             <w:pPr>
               <w:pStyle w:val="Compact"/>
@@ -46266,18 +46391,18 @@
                 <wp:inline>
                   <wp:extent cx="5334000" cy="5000625"/>
                   <wp:effectExtent b="0" l="0" r="0" t="0"/>
-                  <wp:docPr descr="" title="" id="264" name="Picture"/>
+                  <wp:docPr descr="" title="" id="266" name="Picture"/>
                   <a:graphic>
                     <a:graphicData uri="http://schemas.openxmlformats.org/drawingml/2006/picture">
                       <pic:pic>
                         <pic:nvPicPr>
-                          <pic:cNvPr descr="MSE_Thesis_Decomposition_of_CI_Trees_MM_files/figure-docx/fig-appendix-forest-variable-importance-1.pdf" id="265" name="Picture"/>
+                          <pic:cNvPr descr="MSE_Thesis_Decomposition_of_CI_Trees_MM_files/figure-docx/fig-appendix-forest-variable-importance-1.pdf" id="267" name="Picture"/>
                           <pic:cNvPicPr>
                             <a:picLocks noChangeArrowheads="1" noChangeAspect="1"/>
                           </pic:cNvPicPr>
                         </pic:nvPicPr>
                         <pic:blipFill>
-                          <a:blip r:embed="rId263"/>
+                          <a:blip r:embed="rId265"/>
                           <a:stretch>
                             <a:fillRect/>
                           </a:stretch>
@@ -46317,12 +46442,12 @@
               <w:t xml:space="preserve">Figure 22: Top forest variables by concentration-index criterion.</w:t>
             </w:r>
           </w:p>
-          <w:bookmarkEnd w:id="266"/>
+          <w:bookmarkEnd w:id="268"/>
         </w:tc>
       </w:tr>
     </w:tbl>
-    <w:bookmarkEnd w:id="267"/>
-    <w:bookmarkStart w:id="284" w:name="forest-surrogate-trees-plots"/>
+    <w:bookmarkEnd w:id="269"/>
+    <w:bookmarkStart w:id="286" w:name="forest-surrogate-trees-plots"/>
     <w:p>
       <w:pPr>
         <w:pStyle w:val="Heading4"/>
@@ -46358,7 +46483,7 @@
       <w:tr>
         <w:tc>
           <w:tcPr/>
-          <w:bookmarkStart w:id="271" w:name="fig-appendix-forest-surrogate-ci"/>
+          <w:bookmarkStart w:id="273" w:name="fig-appendix-forest-surrogate-ci"/>
           <w:p>
             <w:pPr>
               <w:pStyle w:val="Compact"/>
@@ -46369,18 +46494,18 @@
                 <wp:inline>
                   <wp:extent cx="5334000" cy="2963333"/>
                   <wp:effectExtent b="0" l="0" r="0" t="0"/>
-                  <wp:docPr descr="" title="" id="269" name="Picture"/>
+                  <wp:docPr descr="" title="" id="271" name="Picture"/>
                   <a:graphic>
                     <a:graphicData uri="http://schemas.openxmlformats.org/drawingml/2006/picture">
                       <pic:pic>
                         <pic:nvPicPr>
-                          <pic:cNvPr descr="MSE_Thesis_Decomposition_of_CI_Trees_MM_files/figure-docx/fig-appendix-forest-surrogate-ci-1.pdf" id="270" name="Picture"/>
+                          <pic:cNvPr descr="MSE_Thesis_Decomposition_of_CI_Trees_MM_files/figure-docx/fig-appendix-forest-surrogate-ci-1.pdf" id="272" name="Picture"/>
                           <pic:cNvPicPr>
                             <a:picLocks noChangeArrowheads="1" noChangeAspect="1"/>
                           </pic:cNvPicPr>
                         </pic:nvPicPr>
                         <pic:blipFill>
-                          <a:blip r:embed="rId268"/>
+                          <a:blip r:embed="rId270"/>
                           <a:stretch>
                             <a:fillRect/>
                           </a:stretch>
@@ -46420,7 +46545,7 @@
               <w:t xml:space="preserve">Figure 23: Surrogate tree for the CI concentration-index forest.</w:t>
             </w:r>
           </w:p>
-          <w:bookmarkEnd w:id="271"/>
+          <w:bookmarkEnd w:id="273"/>
         </w:tc>
       </w:tr>
     </w:tbl>
@@ -46437,7 +46562,7 @@
       <w:tr>
         <w:tc>
           <w:tcPr/>
-          <w:bookmarkStart w:id="275" w:name="fig-appendix-forest-surrogate-cig"/>
+          <w:bookmarkStart w:id="277" w:name="fig-appendix-forest-surrogate-cig"/>
           <w:p>
             <w:pPr>
               <w:pStyle w:val="Compact"/>
@@ -46448,18 +46573,18 @@
                 <wp:inline>
                   <wp:extent cx="5334000" cy="2963333"/>
                   <wp:effectExtent b="0" l="0" r="0" t="0"/>
-                  <wp:docPr descr="" title="" id="273" name="Picture"/>
+                  <wp:docPr descr="" title="" id="275" name="Picture"/>
                   <a:graphic>
                     <a:graphicData uri="http://schemas.openxmlformats.org/drawingml/2006/picture">
                       <pic:pic>
                         <pic:nvPicPr>
-                          <pic:cNvPr descr="MSE_Thesis_Decomposition_of_CI_Trees_MM_files/figure-docx/fig-appendix-forest-surrogate-cig-1.pdf" id="274" name="Picture"/>
+                          <pic:cNvPr descr="MSE_Thesis_Decomposition_of_CI_Trees_MM_files/figure-docx/fig-appendix-forest-surrogate-cig-1.pdf" id="276" name="Picture"/>
                           <pic:cNvPicPr>
                             <a:picLocks noChangeArrowheads="1" noChangeAspect="1"/>
                           </pic:cNvPicPr>
                         </pic:nvPicPr>
                         <pic:blipFill>
-                          <a:blip r:embed="rId272"/>
+                          <a:blip r:embed="rId274"/>
                           <a:stretch>
                             <a:fillRect/>
                           </a:stretch>
@@ -46499,7 +46624,7 @@
               <w:t xml:space="preserve">Figure 24: Surrogate tree for the CIg concentration-index forest.</w:t>
             </w:r>
           </w:p>
-          <w:bookmarkEnd w:id="275"/>
+          <w:bookmarkEnd w:id="277"/>
         </w:tc>
       </w:tr>
     </w:tbl>
@@ -46516,7 +46641,7 @@
       <w:tr>
         <w:tc>
           <w:tcPr/>
-          <w:bookmarkStart w:id="279" w:name="fig-appendix-forest-surrogate-cic"/>
+          <w:bookmarkStart w:id="281" w:name="fig-appendix-forest-surrogate-cic"/>
           <w:p>
             <w:pPr>
               <w:pStyle w:val="Compact"/>
@@ -46527,18 +46652,18 @@
                 <wp:inline>
                   <wp:extent cx="5334000" cy="2963333"/>
                   <wp:effectExtent b="0" l="0" r="0" t="0"/>
-                  <wp:docPr descr="" title="" id="277" name="Picture"/>
+                  <wp:docPr descr="" title="" id="279" name="Picture"/>
                   <a:graphic>
                     <a:graphicData uri="http://schemas.openxmlformats.org/drawingml/2006/picture">
                       <pic:pic>
                         <pic:nvPicPr>
-                          <pic:cNvPr descr="MSE_Thesis_Decomposition_of_CI_Trees_MM_files/figure-docx/fig-appendix-forest-surrogate-cic-1.pdf" id="278" name="Picture"/>
+                          <pic:cNvPr descr="MSE_Thesis_Decomposition_of_CI_Trees_MM_files/figure-docx/fig-appendix-forest-surrogate-cic-1.pdf" id="280" name="Picture"/>
                           <pic:cNvPicPr>
                             <a:picLocks noChangeArrowheads="1" noChangeAspect="1"/>
                           </pic:cNvPicPr>
                         </pic:nvPicPr>
                         <pic:blipFill>
-                          <a:blip r:embed="rId276"/>
+                          <a:blip r:embed="rId278"/>
                           <a:stretch>
                             <a:fillRect/>
                           </a:stretch>
@@ -46578,7 +46703,7 @@
               <w:t xml:space="preserve">Figure 25: Surrogate tree for the CIc concentration-index forest.</w:t>
             </w:r>
           </w:p>
-          <w:bookmarkEnd w:id="279"/>
+          <w:bookmarkEnd w:id="281"/>
         </w:tc>
       </w:tr>
     </w:tbl>
@@ -46595,7 +46720,7 @@
       <w:tr>
         <w:tc>
           <w:tcPr/>
-          <w:bookmarkStart w:id="283" w:name="fig-appendix-forest-surrogate-l"/>
+          <w:bookmarkStart w:id="285" w:name="fig-appendix-forest-surrogate-l"/>
           <w:p>
             <w:pPr>
               <w:pStyle w:val="Compact"/>
@@ -46606,18 +46731,18 @@
                 <wp:inline>
                   <wp:extent cx="5334000" cy="2963333"/>
                   <wp:effectExtent b="0" l="0" r="0" t="0"/>
-                  <wp:docPr descr="" title="" id="281" name="Picture"/>
+                  <wp:docPr descr="" title="" id="283" name="Picture"/>
                   <a:graphic>
                     <a:graphicData uri="http://schemas.openxmlformats.org/drawingml/2006/picture">
                       <pic:pic>
                         <pic:nvPicPr>
-                          <pic:cNvPr descr="MSE_Thesis_Decomposition_of_CI_Trees_MM_files/figure-docx/fig-appendix-forest-surrogate-l-1.pdf" id="282" name="Picture"/>
+                          <pic:cNvPr descr="MSE_Thesis_Decomposition_of_CI_Trees_MM_files/figure-docx/fig-appendix-forest-surrogate-l-1.pdf" id="284" name="Picture"/>
                           <pic:cNvPicPr>
                             <a:picLocks noChangeArrowheads="1" noChangeAspect="1"/>
                           </pic:cNvPicPr>
                         </pic:nvPicPr>
                         <pic:blipFill>
-                          <a:blip r:embed="rId280"/>
+                          <a:blip r:embed="rId282"/>
                           <a:stretch>
                             <a:fillRect/>
                           </a:stretch>
@@ -46657,13 +46782,13 @@
               <w:t xml:space="preserve">Figure 26: Surrogate tree for the L concentration-index forest.</w:t>
             </w:r>
           </w:p>
-          <w:bookmarkEnd w:id="283"/>
+          <w:bookmarkEnd w:id="285"/>
         </w:tc>
       </w:tr>
     </w:tbl>
-    <w:bookmarkEnd w:id="284"/>
-    <w:bookmarkEnd w:id="285"/>
-    <w:bookmarkStart w:id="298" w:name="appendix-s-simulation-sensitivity-plots"/>
+    <w:bookmarkEnd w:id="286"/>
+    <w:bookmarkEnd w:id="287"/>
+    <w:bookmarkStart w:id="300" w:name="appendix-s-simulation-sensitivity-plots"/>
     <w:p>
       <w:pPr>
         <w:pStyle w:val="Heading3"/>
@@ -46677,7 +46802,7 @@
         <w:pStyle w:val="FirstParagraph"/>
       </w:pPr>
       <w:r>
-        <w:t xml:space="preserve">The CIg tree is shown in the main results section. The remaining</w:t>
+        <w:t xml:space="preserve">The CIc tree is shown in the main results section. The remaining</w:t>
       </w:r>
       <w:r>
         <w:t xml:space="preserve"> </w:t>
@@ -46705,7 +46830,7 @@
       <w:tr>
         <w:tc>
           <w:tcPr/>
-          <w:bookmarkStart w:id="289" w:name="Xb19a5d97e3e86bc9418a745e34d5880cb39e739"/>
+          <w:bookmarkStart w:id="291" w:name="Xb19a5d97e3e86bc9418a745e34d5880cb39e739"/>
           <w:p>
             <w:pPr>
               <w:pStyle w:val="Compact"/>
@@ -46716,18 +46841,18 @@
                 <wp:inline>
                   <wp:extent cx="5334000" cy="3556000"/>
                   <wp:effectExtent b="0" l="0" r="0" t="0"/>
-                  <wp:docPr descr="" title="" id="287" name="Picture"/>
+                  <wp:docPr descr="" title="" id="289" name="Picture"/>
                   <a:graphic>
                     <a:graphicData uri="http://schemas.openxmlformats.org/drawingml/2006/picture">
                       <pic:pic>
                         <pic:nvPicPr>
-                          <pic:cNvPr descr="MSE_Thesis_Decomposition_of_CI_Trees_MM_files/figure-docx/fig-appendix-simulation-positive-control-ci-1.pdf" id="288" name="Picture"/>
+                          <pic:cNvPr descr="MSE_Thesis_Decomposition_of_CI_Trees_MM_files/figure-docx/fig-appendix-simulation-positive-control-ci-1.pdf" id="290" name="Picture"/>
                           <pic:cNvPicPr>
                             <a:picLocks noChangeArrowheads="1" noChangeAspect="1"/>
                           </pic:cNvPicPr>
                         </pic:nvPicPr>
                         <pic:blipFill>
-                          <a:blip r:embed="rId286"/>
+                          <a:blip r:embed="rId288"/>
                           <a:stretch>
                             <a:fillRect/>
                           </a:stretch>
@@ -46767,7 +46892,7 @@
               <w:t xml:space="preserve">Figure 27: Positive-control simulation tree fitted with the CI criterion.</w:t>
             </w:r>
           </w:p>
-          <w:bookmarkEnd w:id="289"/>
+          <w:bookmarkEnd w:id="291"/>
         </w:tc>
       </w:tr>
     </w:tbl>
@@ -46784,7 +46909,7 @@
       <w:tr>
         <w:tc>
           <w:tcPr/>
-          <w:bookmarkStart w:id="293" w:name="Xf2e3d97d8c4306368157db2ee998b9240cd052e"/>
+          <w:bookmarkStart w:id="295" w:name="X5e7570d48fd3db880d12f7c285f7bea4384c08c"/>
           <w:p>
             <w:pPr>
               <w:pStyle w:val="Compact"/>
@@ -46795,18 +46920,18 @@
                 <wp:inline>
                   <wp:extent cx="5334000" cy="3556000"/>
                   <wp:effectExtent b="0" l="0" r="0" t="0"/>
-                  <wp:docPr descr="" title="" id="291" name="Picture"/>
+                  <wp:docPr descr="" title="" id="293" name="Picture"/>
                   <a:graphic>
                     <a:graphicData uri="http://schemas.openxmlformats.org/drawingml/2006/picture">
                       <pic:pic>
                         <pic:nvPicPr>
-                          <pic:cNvPr descr="MSE_Thesis_Decomposition_of_CI_Trees_MM_files/figure-docx/fig-appendix-simulation-positive-control-cic-1.pdf" id="292" name="Picture"/>
+                          <pic:cNvPr descr="MSE_Thesis_Decomposition_of_CI_Trees_MM_files/figure-docx/fig-appendix-simulation-positive-control-cig-1.pdf" id="294" name="Picture"/>
                           <pic:cNvPicPr>
                             <a:picLocks noChangeArrowheads="1" noChangeAspect="1"/>
                           </pic:cNvPicPr>
                         </pic:nvPicPr>
                         <pic:blipFill>
-                          <a:blip r:embed="rId290"/>
+                          <a:blip r:embed="rId292"/>
                           <a:stretch>
                             <a:fillRect/>
                           </a:stretch>
@@ -46843,10 +46968,10 @@
               <w:pStyle w:val="ImageCaption"/>
             </w:pPr>
             <w:r>
-              <w:t xml:space="preserve">Figure 28: Positive-control simulation tree fitted with the CIc criterion.</w:t>
+              <w:t xml:space="preserve">Figure 28: Positive-control simulation tree fitted with the CIg criterion.</w:t>
             </w:r>
           </w:p>
-          <w:bookmarkEnd w:id="293"/>
+          <w:bookmarkEnd w:id="295"/>
         </w:tc>
       </w:tr>
     </w:tbl>
@@ -46863,7 +46988,7 @@
       <w:tr>
         <w:tc>
           <w:tcPr/>
-          <w:bookmarkStart w:id="297" w:name="Xcb55e91654cd3f0b4a2fc8c6cb68e39fa8518c1"/>
+          <w:bookmarkStart w:id="299" w:name="Xcb55e91654cd3f0b4a2fc8c6cb68e39fa8518c1"/>
           <w:p>
             <w:pPr>
               <w:pStyle w:val="Compact"/>
@@ -46874,18 +46999,18 @@
                 <wp:inline>
                   <wp:extent cx="5334000" cy="3556000"/>
                   <wp:effectExtent b="0" l="0" r="0" t="0"/>
-                  <wp:docPr descr="" title="" id="295" name="Picture"/>
+                  <wp:docPr descr="" title="" id="297" name="Picture"/>
                   <a:graphic>
                     <a:graphicData uri="http://schemas.openxmlformats.org/drawingml/2006/picture">
                       <pic:pic>
                         <pic:nvPicPr>
-                          <pic:cNvPr descr="MSE_Thesis_Decomposition_of_CI_Trees_MM_files/figure-docx/fig-appendix-simulation-positive-control-l-1.pdf" id="296" name="Picture"/>
+                          <pic:cNvPr descr="MSE_Thesis_Decomposition_of_CI_Trees_MM_files/figure-docx/fig-appendix-simulation-positive-control-l-1.pdf" id="298" name="Picture"/>
                           <pic:cNvPicPr>
                             <a:picLocks noChangeArrowheads="1" noChangeAspect="1"/>
                           </pic:cNvPicPr>
                         </pic:nvPicPr>
                         <pic:blipFill>
-                          <a:blip r:embed="rId294"/>
+                          <a:blip r:embed="rId296"/>
                           <a:stretch>
                             <a:fillRect/>
                           </a:stretch>
@@ -46925,13 +47050,13 @@
               <w:t xml:space="preserve">Figure 29: Positive-control simulation tree fitted with the L criterion.</w:t>
             </w:r>
           </w:p>
-          <w:bookmarkEnd w:id="297"/>
+          <w:bookmarkEnd w:id="299"/>
         </w:tc>
       </w:tr>
     </w:tbl>
-    <w:bookmarkEnd w:id="298"/>
-    <w:bookmarkEnd w:id="299"/>
     <w:bookmarkEnd w:id="300"/>
+    <w:bookmarkEnd w:id="301"/>
+    <w:bookmarkEnd w:id="302"/>
     <w:sectPr>
       <w:footnotePr>
         <w:numRestart w:val="eachSect"/>

</xml_diff>